<commit_message>
docs: legg isobarkart med iPhone-barometer inn i feltopplegget
Gruppene måler trykk på et større område fra Vetakollen til Blindern, korrigerer til havnivå og tegner isobarer.

Co-authored-by: MatsAmundsen <MatsAmundsen@users.noreply.github.com>
</commit_message>
<xml_diff>
--- a/opplegg/vaerkart-sognsvann.docx
+++ b/opplegg/vaerkart-sognsvann.docx
@@ -155,6 +155,22 @@
           <w:sz w:val="22"/>
         </w:rPr>
         <w:t>Kompass, eller telefon med kompass, og en stoffstrimmel til post C.</w:t>
+      </w:r>
+    </w:p>
+    <w:p>
+      <w:pPr>
+        <w:pStyle w:val="ListBullet"/>
+        <w:spacing w:before="20" w:after="40" w:line="269" w:lineRule="auto"/>
+      </w:pPr>
+      <w:r>
+        <w:rPr>
+          <w:rFonts w:ascii="Calibri" w:hAnsi="Calibri" w:eastAsia="Calibri"/>
+          <w:b w:val="0"/>
+          <w:i w:val="0"/>
+          <w:color w:val="1A1A1A"/>
+          <w:sz w:val="22"/>
+        </w:rPr>
+        <w:t>iPhone 6 eller nyere, med en barometer-app som viser lufttrykk i hPa. Appen installeres og prøves i klasserommet før dagen.</w:t>
       </w:r>
     </w:p>
     <w:p>
@@ -3383,6 +3399,1387 @@
           <w:color w:val="1B3A4B"/>
           <w:sz w:val="32"/>
         </w:rPr>
+        <w:t>Isobarer for et større område</w:t>
+      </w:r>
+    </w:p>
+    <w:p>
+      <w:pPr>
+        <w:spacing w:before="0" w:after="160" w:line="276" w:lineRule="auto"/>
+      </w:pPr>
+      <w:r>
+        <w:rPr>
+          <w:rFonts w:ascii="Calibri" w:hAnsi="Calibri" w:eastAsia="Calibri"/>
+          <w:b w:val="0"/>
+          <w:i w:val="0"/>
+          <w:color w:val="1A1A1A"/>
+          <w:sz w:val="22"/>
+        </w:rPr>
+        <w:t>Runden rundt vannet er for liten til å tegne isobarer. Trykkforskjellen langs en ekte isobar over 3 km er mindre enn forskjellen mellom to telefoner. Isobarene tegnes derfor for et større område: fra Vetakolltoppen og Sognsvann sørover langs T-banen til Blindern, med ett punkt østover mot Svartkulp.</w:t>
+      </w:r>
+    </w:p>
+    <w:p>
+      <w:pPr>
+        <w:spacing w:before="0" w:after="80" w:line="276" w:lineRule="auto"/>
+      </w:pPr>
+      <w:r>
+        <w:rPr>
+          <w:rFonts w:ascii="Calibri" w:hAnsi="Calibri" w:eastAsia="Calibri"/>
+          <w:b/>
+          <w:i w:val="0"/>
+          <w:color w:val="1A1A1A"/>
+          <w:sz w:val="22"/>
+        </w:rPr>
+        <w:t>iPhone som barometer</w:t>
+      </w:r>
+    </w:p>
+    <w:p>
+      <w:pPr>
+        <w:pStyle w:val="ListBullet"/>
+        <w:spacing w:before="20" w:after="40" w:line="269" w:lineRule="auto"/>
+      </w:pPr>
+      <w:r>
+        <w:rPr>
+          <w:rFonts w:ascii="Calibri" w:hAnsi="Calibri" w:eastAsia="Calibri"/>
+          <w:b w:val="0"/>
+          <w:i w:val="0"/>
+          <w:color w:val="1A1A1A"/>
+          <w:sz w:val="22"/>
+        </w:rPr>
+        <w:t>iPhone 6 og nyere har barometer. Eldre telefoner har det ikke.</w:t>
+      </w:r>
+    </w:p>
+    <w:p>
+      <w:pPr>
+        <w:pStyle w:val="ListBullet"/>
+        <w:spacing w:before="20" w:after="40" w:line="269" w:lineRule="auto"/>
+      </w:pPr>
+      <w:r>
+        <w:rPr>
+          <w:rFonts w:ascii="Calibri" w:hAnsi="Calibri" w:eastAsia="Calibri"/>
+          <w:b w:val="0"/>
+          <w:i w:val="0"/>
+          <w:color w:val="1A1A1A"/>
+          <w:sz w:val="22"/>
+        </w:rPr>
+        <w:t>Appen skal vise hektopascal (hPa). En app som bare viser høyde, holder ikke.</w:t>
+      </w:r>
+    </w:p>
+    <w:p>
+      <w:pPr>
+        <w:pStyle w:val="ListBullet"/>
+        <w:spacing w:before="20" w:after="40" w:line="269" w:lineRule="auto"/>
+      </w:pPr>
+      <w:r>
+        <w:rPr>
+          <w:rFonts w:ascii="Calibri" w:hAnsi="Calibri" w:eastAsia="Calibri"/>
+          <w:b w:val="0"/>
+          <w:i w:val="0"/>
+          <w:color w:val="1A1A1A"/>
+          <w:sz w:val="22"/>
+        </w:rPr>
+        <w:t>Telefonen ligger stille på en benk, eller holdes i brysthøyde. Ute, ikke i lomma, og ikke rett fra en varm jakke.</w:t>
+      </w:r>
+    </w:p>
+    <w:p>
+      <w:pPr>
+        <w:pStyle w:val="ListBullet"/>
+        <w:spacing w:before="20" w:after="40" w:line="269" w:lineRule="auto"/>
+      </w:pPr>
+      <w:r>
+        <w:rPr>
+          <w:rFonts w:ascii="Calibri" w:hAnsi="Calibri" w:eastAsia="Calibri"/>
+          <w:b w:val="0"/>
+          <w:i w:val="0"/>
+          <w:color w:val="1A1A1A"/>
+          <w:sz w:val="22"/>
+        </w:rPr>
+        <w:t>Vent til tallet roer seg, omtrent ett minutt. Skriv verdien med én desimal hvis appen viser det.</w:t>
+      </w:r>
+    </w:p>
+    <w:p>
+      <w:pPr>
+        <w:spacing w:before="0" w:after="160" w:line="276" w:lineRule="auto"/>
+      </w:pPr>
+      <w:r>
+        <w:rPr>
+          <w:rFonts w:ascii="Calibri" w:hAnsi="Calibri" w:eastAsia="Calibri"/>
+          <w:b w:val="0"/>
+          <w:i w:val="0"/>
+          <w:color w:val="1A1A1A"/>
+          <w:sz w:val="22"/>
+        </w:rPr>
+        <w:t>Før gruppene sprer seg, står alle samlet ved Sognsvann stasjon. På samme minutt leser alle telefonene, og værstasjonen hvis den viser hPa. Referansen er værstasjonen. Mangler den trykk, er referansen én avtalt telefon. Hver telefon skriver avvik = referanse minus egen avlesning. I felt er korrigert trykk = avlesning pluss avvik.</w:t>
+      </w:r>
+    </w:p>
+    <w:p>
+      <w:pPr>
+        <w:spacing w:before="0" w:after="160" w:line="276" w:lineRule="auto"/>
+      </w:pPr>
+      <w:r>
+        <w:rPr>
+          <w:rFonts w:ascii="Calibri" w:hAnsi="Calibri" w:eastAsia="Calibri"/>
+          <w:b w:val="0"/>
+          <w:i w:val="0"/>
+          <w:color w:val="1A1A1A"/>
+          <w:sz w:val="22"/>
+        </w:rPr>
+        <w:t>Gruppene går hver sin vei med en gang, og leser av på samme avtalte minutt. Mål ute, ikke i togvognen.</w:t>
+      </w:r>
+    </w:p>
+    <w:tbl>
+      <w:tblPr>
+        <w:tblW w:type="auto" w:w="0"/>
+        <w:jc w:val="center"/>
+        <w:tblLayout w:type="fixed"/>
+        <w:tblLook w:firstColumn="1" w:firstRow="1" w:lastColumn="0" w:lastRow="0" w:noHBand="0" w:noVBand="1" w:val="04A0"/>
+        <w:tblW w:w="9468" w:type="dxa"/>
+        <w:tblLayout w:type="fixed"/>
+      </w:tblPr>
+      <w:tblGrid>
+        <w:gridCol w:w="2409"/>
+        <w:gridCol w:w="2409"/>
+        <w:gridCol w:w="2409"/>
+        <w:gridCol w:w="2409"/>
+      </w:tblGrid>
+      <w:tr>
+        <w:trPr>
+          <w:cantSplit/>
+        </w:trPr>
+        <w:tc>
+          <w:tcPr>
+            <w:tcW w:type="dxa" w:w="1247"/>
+            <w:tcBorders>
+              <w:top w:val="single" w:sz="4" w:space="0" w:color="D5DEDE"/>
+              <w:left w:val="single" w:sz="4" w:space="0" w:color="D5DEDE"/>
+              <w:bottom w:val="single" w:sz="4" w:space="0" w:color="D5DEDE"/>
+              <w:right w:val="single" w:sz="4" w:space="0" w:color="D5DEDE"/>
+            </w:tcBorders>
+            <w:tcMar>
+              <w:top w:w="80" w:type="dxa"/>
+              <w:left w:w="80" w:type="dxa"/>
+              <w:bottom w:w="80" w:type="dxa"/>
+              <w:right w:w="80" w:type="dxa"/>
+            </w:tcMar>
+            <w:shd w:fill="1B3A4B" w:val="clear"/>
+          </w:tcPr>
+          <w:p>
+            <w:pPr>
+              <w:spacing w:before="0" w:after="0" w:line="259" w:lineRule="auto"/>
+              <w:jc w:val="left"/>
+            </w:pPr>
+            <w:r/>
+            <w:r>
+              <w:rPr>
+                <w:rFonts w:ascii="Calibri" w:hAnsi="Calibri" w:eastAsia="Calibri"/>
+                <w:b/>
+                <w:i w:val="0"/>
+                <w:color w:val="FFFFFF"/>
+                <w:sz w:val="21"/>
+              </w:rPr>
+              <w:t>Gruppe</w:t>
+            </w:r>
+          </w:p>
+        </w:tc>
+        <w:tc>
+          <w:tcPr>
+            <w:tcW w:type="dxa" w:w="2494"/>
+            <w:tcBorders>
+              <w:top w:val="single" w:sz="4" w:space="0" w:color="D5DEDE"/>
+              <w:left w:val="single" w:sz="4" w:space="0" w:color="D5DEDE"/>
+              <w:bottom w:val="single" w:sz="4" w:space="0" w:color="D5DEDE"/>
+              <w:right w:val="single" w:sz="4" w:space="0" w:color="D5DEDE"/>
+            </w:tcBorders>
+            <w:tcMar>
+              <w:top w:w="80" w:type="dxa"/>
+              <w:left w:w="80" w:type="dxa"/>
+              <w:bottom w:w="80" w:type="dxa"/>
+              <w:right w:w="80" w:type="dxa"/>
+            </w:tcMar>
+            <w:shd w:fill="1B3A4B" w:val="clear"/>
+          </w:tcPr>
+          <w:p>
+            <w:pPr>
+              <w:spacing w:before="0" w:after="0" w:line="259" w:lineRule="auto"/>
+              <w:jc w:val="left"/>
+            </w:pPr>
+            <w:r/>
+            <w:r>
+              <w:rPr>
+                <w:rFonts w:ascii="Calibri" w:hAnsi="Calibri" w:eastAsia="Calibri"/>
+                <w:b/>
+                <w:i w:val="0"/>
+                <w:color w:val="FFFFFF"/>
+                <w:sz w:val="21"/>
+              </w:rPr>
+              <w:t>Punkt</w:t>
+            </w:r>
+          </w:p>
+        </w:tc>
+        <w:tc>
+          <w:tcPr>
+            <w:tcW w:type="dxa" w:w="2948"/>
+            <w:tcBorders>
+              <w:top w:val="single" w:sz="4" w:space="0" w:color="D5DEDE"/>
+              <w:left w:val="single" w:sz="4" w:space="0" w:color="D5DEDE"/>
+              <w:bottom w:val="single" w:sz="4" w:space="0" w:color="D5DEDE"/>
+              <w:right w:val="single" w:sz="4" w:space="0" w:color="D5DEDE"/>
+            </w:tcBorders>
+            <w:tcMar>
+              <w:top w:w="80" w:type="dxa"/>
+              <w:left w:w="80" w:type="dxa"/>
+              <w:bottom w:w="80" w:type="dxa"/>
+              <w:right w:w="80" w:type="dxa"/>
+            </w:tcMar>
+            <w:shd w:fill="1B3A4B" w:val="clear"/>
+          </w:tcPr>
+          <w:p>
+            <w:pPr>
+              <w:spacing w:before="0" w:after="0" w:line="259" w:lineRule="auto"/>
+              <w:jc w:val="left"/>
+            </w:pPr>
+            <w:r/>
+            <w:r>
+              <w:rPr>
+                <w:rFonts w:ascii="Calibri" w:hAnsi="Calibri" w:eastAsia="Calibri"/>
+                <w:b/>
+                <w:i w:val="0"/>
+                <w:color w:val="FFFFFF"/>
+                <w:sz w:val="21"/>
+              </w:rPr>
+              <w:t>Vei</w:t>
+            </w:r>
+          </w:p>
+        </w:tc>
+        <w:tc>
+          <w:tcPr>
+            <w:tcW w:type="dxa" w:w="2778"/>
+            <w:tcBorders>
+              <w:top w:val="single" w:sz="4" w:space="0" w:color="D5DEDE"/>
+              <w:left w:val="single" w:sz="4" w:space="0" w:color="D5DEDE"/>
+              <w:bottom w:val="single" w:sz="4" w:space="0" w:color="D5DEDE"/>
+              <w:right w:val="single" w:sz="4" w:space="0" w:color="D5DEDE"/>
+            </w:tcBorders>
+            <w:tcMar>
+              <w:top w:w="80" w:type="dxa"/>
+              <w:left w:w="80" w:type="dxa"/>
+              <w:bottom w:w="80" w:type="dxa"/>
+              <w:right w:w="80" w:type="dxa"/>
+            </w:tcMar>
+            <w:shd w:fill="1B3A4B" w:val="clear"/>
+          </w:tcPr>
+          <w:p>
+            <w:pPr>
+              <w:spacing w:before="0" w:after="0" w:line="259" w:lineRule="auto"/>
+              <w:jc w:val="left"/>
+            </w:pPr>
+            <w:r/>
+            <w:r>
+              <w:rPr>
+                <w:rFonts w:ascii="Calibri" w:hAnsi="Calibri" w:eastAsia="Calibri"/>
+                <w:b/>
+                <w:i w:val="0"/>
+                <w:color w:val="FFFFFF"/>
+                <w:sz w:val="21"/>
+              </w:rPr>
+              <w:t>Høyde</w:t>
+            </w:r>
+          </w:p>
+        </w:tc>
+      </w:tr>
+      <w:tr>
+        <w:trPr>
+          <w:cantSplit/>
+        </w:trPr>
+        <w:tc>
+          <w:tcPr>
+            <w:tcW w:type="dxa" w:w="1247"/>
+            <w:tcBorders>
+              <w:top w:val="single" w:sz="4" w:space="0" w:color="D5DEDE"/>
+              <w:left w:val="single" w:sz="4" w:space="0" w:color="D5DEDE"/>
+              <w:bottom w:val="single" w:sz="4" w:space="0" w:color="D5DEDE"/>
+              <w:right w:val="single" w:sz="4" w:space="0" w:color="D5DEDE"/>
+            </w:tcBorders>
+            <w:tcMar>
+              <w:top w:w="80" w:type="dxa"/>
+              <w:left w:w="80" w:type="dxa"/>
+              <w:bottom w:w="80" w:type="dxa"/>
+              <w:right w:w="80" w:type="dxa"/>
+            </w:tcMar>
+            <w:shd w:fill="FFFFFF" w:val="clear"/>
+          </w:tcPr>
+          <w:p>
+            <w:pPr>
+              <w:spacing w:before="0" w:after="0" w:line="259" w:lineRule="auto"/>
+              <w:jc w:val="left"/>
+            </w:pPr>
+            <w:r/>
+            <w:r>
+              <w:rPr>
+                <w:rFonts w:ascii="Calibri" w:hAnsi="Calibri" w:eastAsia="Calibri"/>
+                <w:b w:val="0"/>
+                <w:i w:val="0"/>
+                <w:color w:val="1A1A1A"/>
+                <w:sz w:val="21"/>
+              </w:rPr>
+              <w:t>1</w:t>
+            </w:r>
+          </w:p>
+        </w:tc>
+        <w:tc>
+          <w:tcPr>
+            <w:tcW w:type="dxa" w:w="2494"/>
+            <w:tcBorders>
+              <w:top w:val="single" w:sz="4" w:space="0" w:color="D5DEDE"/>
+              <w:left w:val="single" w:sz="4" w:space="0" w:color="D5DEDE"/>
+              <w:bottom w:val="single" w:sz="4" w:space="0" w:color="D5DEDE"/>
+              <w:right w:val="single" w:sz="4" w:space="0" w:color="D5DEDE"/>
+            </w:tcBorders>
+            <w:tcMar>
+              <w:top w:w="80" w:type="dxa"/>
+              <w:left w:w="80" w:type="dxa"/>
+              <w:bottom w:w="80" w:type="dxa"/>
+              <w:right w:w="80" w:type="dxa"/>
+            </w:tcMar>
+            <w:shd w:fill="FFFFFF" w:val="clear"/>
+          </w:tcPr>
+          <w:p>
+            <w:pPr>
+              <w:spacing w:before="0" w:after="0" w:line="259" w:lineRule="auto"/>
+              <w:jc w:val="left"/>
+            </w:pPr>
+            <w:r/>
+            <w:r>
+              <w:rPr>
+                <w:rFonts w:ascii="Calibri" w:hAnsi="Calibri" w:eastAsia="Calibri"/>
+                <w:b w:val="0"/>
+                <w:i w:val="0"/>
+                <w:color w:val="1A1A1A"/>
+                <w:sz w:val="21"/>
+              </w:rPr>
+              <w:t>Vetakolltoppen</w:t>
+            </w:r>
+          </w:p>
+        </w:tc>
+        <w:tc>
+          <w:tcPr>
+            <w:tcW w:type="dxa" w:w="2948"/>
+            <w:tcBorders>
+              <w:top w:val="single" w:sz="4" w:space="0" w:color="D5DEDE"/>
+              <w:left w:val="single" w:sz="4" w:space="0" w:color="D5DEDE"/>
+              <w:bottom w:val="single" w:sz="4" w:space="0" w:color="D5DEDE"/>
+              <w:right w:val="single" w:sz="4" w:space="0" w:color="D5DEDE"/>
+            </w:tcBorders>
+            <w:tcMar>
+              <w:top w:w="80" w:type="dxa"/>
+              <w:left w:w="80" w:type="dxa"/>
+              <w:bottom w:w="80" w:type="dxa"/>
+              <w:right w:w="80" w:type="dxa"/>
+            </w:tcMar>
+            <w:shd w:fill="FFFFFF" w:val="clear"/>
+          </w:tcPr>
+          <w:p>
+            <w:pPr>
+              <w:spacing w:before="0" w:after="0" w:line="259" w:lineRule="auto"/>
+              <w:jc w:val="left"/>
+            </w:pPr>
+            <w:r/>
+            <w:r>
+              <w:rPr>
+                <w:rFonts w:ascii="Calibri" w:hAnsi="Calibri" w:eastAsia="Calibri"/>
+                <w:b w:val="0"/>
+                <w:i w:val="0"/>
+                <w:color w:val="1A1A1A"/>
+                <w:sz w:val="21"/>
+              </w:rPr>
+              <w:t>Gå vest fra Sognsvann.</w:t>
+            </w:r>
+          </w:p>
+        </w:tc>
+        <w:tc>
+          <w:tcPr>
+            <w:tcW w:type="dxa" w:w="2778"/>
+            <w:tcBorders>
+              <w:top w:val="single" w:sz="4" w:space="0" w:color="D5DEDE"/>
+              <w:left w:val="single" w:sz="4" w:space="0" w:color="D5DEDE"/>
+              <w:bottom w:val="single" w:sz="4" w:space="0" w:color="D5DEDE"/>
+              <w:right w:val="single" w:sz="4" w:space="0" w:color="D5DEDE"/>
+            </w:tcBorders>
+            <w:tcMar>
+              <w:top w:w="80" w:type="dxa"/>
+              <w:left w:w="80" w:type="dxa"/>
+              <w:bottom w:w="80" w:type="dxa"/>
+              <w:right w:w="80" w:type="dxa"/>
+            </w:tcMar>
+            <w:shd w:fill="FFFFFF" w:val="clear"/>
+          </w:tcPr>
+          <w:p>
+            <w:pPr>
+              <w:spacing w:before="0" w:after="0" w:line="259" w:lineRule="auto"/>
+              <w:jc w:val="left"/>
+            </w:pPr>
+            <w:r/>
+            <w:r>
+              <w:rPr>
+                <w:rFonts w:ascii="Calibri" w:hAnsi="Calibri" w:eastAsia="Calibri"/>
+                <w:b w:val="0"/>
+                <w:i w:val="0"/>
+                <w:color w:val="1A1A1A"/>
+                <w:sz w:val="21"/>
+              </w:rPr>
+              <w:t>419 m. Sjekk koten der dere står.</w:t>
+            </w:r>
+          </w:p>
+        </w:tc>
+      </w:tr>
+      <w:tr>
+        <w:trPr>
+          <w:cantSplit/>
+        </w:trPr>
+        <w:tc>
+          <w:tcPr>
+            <w:tcW w:type="dxa" w:w="1247"/>
+            <w:tcBorders>
+              <w:top w:val="single" w:sz="4" w:space="0" w:color="D5DEDE"/>
+              <w:left w:val="single" w:sz="4" w:space="0" w:color="D5DEDE"/>
+              <w:bottom w:val="single" w:sz="4" w:space="0" w:color="D5DEDE"/>
+              <w:right w:val="single" w:sz="4" w:space="0" w:color="D5DEDE"/>
+            </w:tcBorders>
+            <w:tcMar>
+              <w:top w:w="80" w:type="dxa"/>
+              <w:left w:w="80" w:type="dxa"/>
+              <w:bottom w:w="80" w:type="dxa"/>
+              <w:right w:w="80" w:type="dxa"/>
+            </w:tcMar>
+            <w:shd w:fill="F4F7F7" w:val="clear"/>
+          </w:tcPr>
+          <w:p>
+            <w:pPr>
+              <w:spacing w:before="0" w:after="0" w:line="259" w:lineRule="auto"/>
+              <w:jc w:val="left"/>
+            </w:pPr>
+            <w:r/>
+            <w:r>
+              <w:rPr>
+                <w:rFonts w:ascii="Calibri" w:hAnsi="Calibri" w:eastAsia="Calibri"/>
+                <w:b w:val="0"/>
+                <w:i w:val="0"/>
+                <w:color w:val="1A1A1A"/>
+                <w:sz w:val="21"/>
+              </w:rPr>
+              <w:t>2</w:t>
+            </w:r>
+          </w:p>
+        </w:tc>
+        <w:tc>
+          <w:tcPr>
+            <w:tcW w:type="dxa" w:w="2494"/>
+            <w:tcBorders>
+              <w:top w:val="single" w:sz="4" w:space="0" w:color="D5DEDE"/>
+              <w:left w:val="single" w:sz="4" w:space="0" w:color="D5DEDE"/>
+              <w:bottom w:val="single" w:sz="4" w:space="0" w:color="D5DEDE"/>
+              <w:right w:val="single" w:sz="4" w:space="0" w:color="D5DEDE"/>
+            </w:tcBorders>
+            <w:tcMar>
+              <w:top w:w="80" w:type="dxa"/>
+              <w:left w:w="80" w:type="dxa"/>
+              <w:bottom w:w="80" w:type="dxa"/>
+              <w:right w:w="80" w:type="dxa"/>
+            </w:tcMar>
+            <w:shd w:fill="F4F7F7" w:val="clear"/>
+          </w:tcPr>
+          <w:p>
+            <w:pPr>
+              <w:spacing w:before="0" w:after="0" w:line="259" w:lineRule="auto"/>
+              <w:jc w:val="left"/>
+            </w:pPr>
+            <w:r/>
+            <w:r>
+              <w:rPr>
+                <w:rFonts w:ascii="Calibri" w:hAnsi="Calibri" w:eastAsia="Calibri"/>
+                <w:b w:val="0"/>
+                <w:i w:val="0"/>
+                <w:color w:val="1A1A1A"/>
+                <w:sz w:val="21"/>
+              </w:rPr>
+              <w:t>Sognsvann stasjon</w:t>
+            </w:r>
+          </w:p>
+        </w:tc>
+        <w:tc>
+          <w:tcPr>
+            <w:tcW w:type="dxa" w:w="2948"/>
+            <w:tcBorders>
+              <w:top w:val="single" w:sz="4" w:space="0" w:color="D5DEDE"/>
+              <w:left w:val="single" w:sz="4" w:space="0" w:color="D5DEDE"/>
+              <w:bottom w:val="single" w:sz="4" w:space="0" w:color="D5DEDE"/>
+              <w:right w:val="single" w:sz="4" w:space="0" w:color="D5DEDE"/>
+            </w:tcBorders>
+            <w:tcMar>
+              <w:top w:w="80" w:type="dxa"/>
+              <w:left w:w="80" w:type="dxa"/>
+              <w:bottom w:w="80" w:type="dxa"/>
+              <w:right w:w="80" w:type="dxa"/>
+            </w:tcMar>
+            <w:shd w:fill="F4F7F7" w:val="clear"/>
+          </w:tcPr>
+          <w:p>
+            <w:pPr>
+              <w:spacing w:before="0" w:after="0" w:line="259" w:lineRule="auto"/>
+              <w:jc w:val="left"/>
+            </w:pPr>
+            <w:r/>
+            <w:r>
+              <w:rPr>
+                <w:rFonts w:ascii="Calibri" w:hAnsi="Calibri" w:eastAsia="Calibri"/>
+                <w:b w:val="0"/>
+                <w:i w:val="0"/>
+                <w:color w:val="1A1A1A"/>
+                <w:sz w:val="21"/>
+              </w:rPr>
+              <w:t>Blir på perrongen, ute.</w:t>
+            </w:r>
+          </w:p>
+        </w:tc>
+        <w:tc>
+          <w:tcPr>
+            <w:tcW w:type="dxa" w:w="2778"/>
+            <w:tcBorders>
+              <w:top w:val="single" w:sz="4" w:space="0" w:color="D5DEDE"/>
+              <w:left w:val="single" w:sz="4" w:space="0" w:color="D5DEDE"/>
+              <w:bottom w:val="single" w:sz="4" w:space="0" w:color="D5DEDE"/>
+              <w:right w:val="single" w:sz="4" w:space="0" w:color="D5DEDE"/>
+            </w:tcBorders>
+            <w:tcMar>
+              <w:top w:w="80" w:type="dxa"/>
+              <w:left w:w="80" w:type="dxa"/>
+              <w:bottom w:w="80" w:type="dxa"/>
+              <w:right w:w="80" w:type="dxa"/>
+            </w:tcMar>
+            <w:shd w:fill="F4F7F7" w:val="clear"/>
+          </w:tcPr>
+          <w:p>
+            <w:pPr>
+              <w:spacing w:before="0" w:after="0" w:line="259" w:lineRule="auto"/>
+              <w:jc w:val="left"/>
+            </w:pPr>
+            <w:r/>
+            <w:r>
+              <w:rPr>
+                <w:rFonts w:ascii="Calibri" w:hAnsi="Calibri" w:eastAsia="Calibri"/>
+                <w:b w:val="0"/>
+                <w:i w:val="0"/>
+                <w:color w:val="1A1A1A"/>
+                <w:sz w:val="21"/>
+              </w:rPr>
+              <w:t>198 m. Det er stasjonen, ikke vannflaten på 183 m.</w:t>
+            </w:r>
+          </w:p>
+        </w:tc>
+      </w:tr>
+      <w:tr>
+        <w:trPr>
+          <w:cantSplit/>
+        </w:trPr>
+        <w:tc>
+          <w:tcPr>
+            <w:tcW w:type="dxa" w:w="1247"/>
+            <w:tcBorders>
+              <w:top w:val="single" w:sz="4" w:space="0" w:color="D5DEDE"/>
+              <w:left w:val="single" w:sz="4" w:space="0" w:color="D5DEDE"/>
+              <w:bottom w:val="single" w:sz="4" w:space="0" w:color="D5DEDE"/>
+              <w:right w:val="single" w:sz="4" w:space="0" w:color="D5DEDE"/>
+            </w:tcBorders>
+            <w:tcMar>
+              <w:top w:w="80" w:type="dxa"/>
+              <w:left w:w="80" w:type="dxa"/>
+              <w:bottom w:w="80" w:type="dxa"/>
+              <w:right w:w="80" w:type="dxa"/>
+            </w:tcMar>
+            <w:shd w:fill="FFFFFF" w:val="clear"/>
+          </w:tcPr>
+          <w:p>
+            <w:pPr>
+              <w:spacing w:before="0" w:after="0" w:line="259" w:lineRule="auto"/>
+              <w:jc w:val="left"/>
+            </w:pPr>
+            <w:r/>
+            <w:r>
+              <w:rPr>
+                <w:rFonts w:ascii="Calibri" w:hAnsi="Calibri" w:eastAsia="Calibri"/>
+                <w:b w:val="0"/>
+                <w:i w:val="0"/>
+                <w:color w:val="1A1A1A"/>
+                <w:sz w:val="21"/>
+              </w:rPr>
+              <w:t>3</w:t>
+            </w:r>
+          </w:p>
+        </w:tc>
+        <w:tc>
+          <w:tcPr>
+            <w:tcW w:type="dxa" w:w="2494"/>
+            <w:tcBorders>
+              <w:top w:val="single" w:sz="4" w:space="0" w:color="D5DEDE"/>
+              <w:left w:val="single" w:sz="4" w:space="0" w:color="D5DEDE"/>
+              <w:bottom w:val="single" w:sz="4" w:space="0" w:color="D5DEDE"/>
+              <w:right w:val="single" w:sz="4" w:space="0" w:color="D5DEDE"/>
+            </w:tcBorders>
+            <w:tcMar>
+              <w:top w:w="80" w:type="dxa"/>
+              <w:left w:w="80" w:type="dxa"/>
+              <w:bottom w:w="80" w:type="dxa"/>
+              <w:right w:w="80" w:type="dxa"/>
+            </w:tcMar>
+            <w:shd w:fill="FFFFFF" w:val="clear"/>
+          </w:tcPr>
+          <w:p>
+            <w:pPr>
+              <w:spacing w:before="0" w:after="0" w:line="259" w:lineRule="auto"/>
+              <w:jc w:val="left"/>
+            </w:pPr>
+            <w:r/>
+            <w:r>
+              <w:rPr>
+                <w:rFonts w:ascii="Calibri" w:hAnsi="Calibri" w:eastAsia="Calibri"/>
+                <w:b w:val="0"/>
+                <w:i w:val="0"/>
+                <w:color w:val="1A1A1A"/>
+                <w:sz w:val="21"/>
+              </w:rPr>
+              <w:t>Svartkulp, øst for Sognsvann</w:t>
+            </w:r>
+          </w:p>
+        </w:tc>
+        <w:tc>
+          <w:tcPr>
+            <w:tcW w:type="dxa" w:w="2948"/>
+            <w:tcBorders>
+              <w:top w:val="single" w:sz="4" w:space="0" w:color="D5DEDE"/>
+              <w:left w:val="single" w:sz="4" w:space="0" w:color="D5DEDE"/>
+              <w:bottom w:val="single" w:sz="4" w:space="0" w:color="D5DEDE"/>
+              <w:right w:val="single" w:sz="4" w:space="0" w:color="D5DEDE"/>
+            </w:tcBorders>
+            <w:tcMar>
+              <w:top w:w="80" w:type="dxa"/>
+              <w:left w:w="80" w:type="dxa"/>
+              <w:bottom w:w="80" w:type="dxa"/>
+              <w:right w:w="80" w:type="dxa"/>
+            </w:tcMar>
+            <w:shd w:fill="FFFFFF" w:val="clear"/>
+          </w:tcPr>
+          <w:p>
+            <w:pPr>
+              <w:spacing w:before="0" w:after="0" w:line="259" w:lineRule="auto"/>
+              <w:jc w:val="left"/>
+            </w:pPr>
+            <w:r/>
+            <w:r>
+              <w:rPr>
+                <w:rFonts w:ascii="Calibri" w:hAnsi="Calibri" w:eastAsia="Calibri"/>
+                <w:b w:val="0"/>
+                <w:i w:val="0"/>
+                <w:color w:val="1A1A1A"/>
+                <w:sz w:val="21"/>
+              </w:rPr>
+              <w:t>Gå østover, om lag 10 minutter.</w:t>
+            </w:r>
+          </w:p>
+        </w:tc>
+        <w:tc>
+          <w:tcPr>
+            <w:tcW w:type="dxa" w:w="2778"/>
+            <w:tcBorders>
+              <w:top w:val="single" w:sz="4" w:space="0" w:color="D5DEDE"/>
+              <w:left w:val="single" w:sz="4" w:space="0" w:color="D5DEDE"/>
+              <w:bottom w:val="single" w:sz="4" w:space="0" w:color="D5DEDE"/>
+              <w:right w:val="single" w:sz="4" w:space="0" w:color="D5DEDE"/>
+            </w:tcBorders>
+            <w:tcMar>
+              <w:top w:w="80" w:type="dxa"/>
+              <w:left w:w="80" w:type="dxa"/>
+              <w:bottom w:w="80" w:type="dxa"/>
+              <w:right w:w="80" w:type="dxa"/>
+            </w:tcMar>
+            <w:shd w:fill="FFFFFF" w:val="clear"/>
+          </w:tcPr>
+          <w:p>
+            <w:pPr>
+              <w:spacing w:before="0" w:after="0" w:line="259" w:lineRule="auto"/>
+              <w:jc w:val="left"/>
+            </w:pPr>
+            <w:r/>
+            <w:r>
+              <w:rPr>
+                <w:rFonts w:ascii="Calibri" w:hAnsi="Calibri" w:eastAsia="Calibri"/>
+                <w:b w:val="0"/>
+                <w:i w:val="0"/>
+                <w:color w:val="1A1A1A"/>
+                <w:sz w:val="21"/>
+              </w:rPr>
+              <w:t>Les koten på kartet der dere står.</w:t>
+            </w:r>
+          </w:p>
+        </w:tc>
+      </w:tr>
+      <w:tr>
+        <w:trPr>
+          <w:cantSplit/>
+        </w:trPr>
+        <w:tc>
+          <w:tcPr>
+            <w:tcW w:type="dxa" w:w="1247"/>
+            <w:tcBorders>
+              <w:top w:val="single" w:sz="4" w:space="0" w:color="D5DEDE"/>
+              <w:left w:val="single" w:sz="4" w:space="0" w:color="D5DEDE"/>
+              <w:bottom w:val="single" w:sz="4" w:space="0" w:color="D5DEDE"/>
+              <w:right w:val="single" w:sz="4" w:space="0" w:color="D5DEDE"/>
+            </w:tcBorders>
+            <w:tcMar>
+              <w:top w:w="80" w:type="dxa"/>
+              <w:left w:w="80" w:type="dxa"/>
+              <w:bottom w:w="80" w:type="dxa"/>
+              <w:right w:w="80" w:type="dxa"/>
+            </w:tcMar>
+            <w:shd w:fill="F4F7F7" w:val="clear"/>
+          </w:tcPr>
+          <w:p>
+            <w:pPr>
+              <w:spacing w:before="0" w:after="0" w:line="259" w:lineRule="auto"/>
+              <w:jc w:val="left"/>
+            </w:pPr>
+            <w:r/>
+            <w:r>
+              <w:rPr>
+                <w:rFonts w:ascii="Calibri" w:hAnsi="Calibri" w:eastAsia="Calibri"/>
+                <w:b w:val="0"/>
+                <w:i w:val="0"/>
+                <w:color w:val="1A1A1A"/>
+                <w:sz w:val="21"/>
+              </w:rPr>
+              <w:t>4</w:t>
+            </w:r>
+          </w:p>
+        </w:tc>
+        <w:tc>
+          <w:tcPr>
+            <w:tcW w:type="dxa" w:w="2494"/>
+            <w:tcBorders>
+              <w:top w:val="single" w:sz="4" w:space="0" w:color="D5DEDE"/>
+              <w:left w:val="single" w:sz="4" w:space="0" w:color="D5DEDE"/>
+              <w:bottom w:val="single" w:sz="4" w:space="0" w:color="D5DEDE"/>
+              <w:right w:val="single" w:sz="4" w:space="0" w:color="D5DEDE"/>
+            </w:tcBorders>
+            <w:tcMar>
+              <w:top w:w="80" w:type="dxa"/>
+              <w:left w:w="80" w:type="dxa"/>
+              <w:bottom w:w="80" w:type="dxa"/>
+              <w:right w:w="80" w:type="dxa"/>
+            </w:tcMar>
+            <w:shd w:fill="F4F7F7" w:val="clear"/>
+          </w:tcPr>
+          <w:p>
+            <w:pPr>
+              <w:spacing w:before="0" w:after="0" w:line="259" w:lineRule="auto"/>
+              <w:jc w:val="left"/>
+            </w:pPr>
+            <w:r/>
+            <w:r>
+              <w:rPr>
+                <w:rFonts w:ascii="Calibri" w:hAnsi="Calibri" w:eastAsia="Calibri"/>
+                <w:b w:val="0"/>
+                <w:i w:val="0"/>
+                <w:color w:val="1A1A1A"/>
+                <w:sz w:val="21"/>
+              </w:rPr>
+              <w:t>Tåsen stasjon</w:t>
+            </w:r>
+          </w:p>
+        </w:tc>
+        <w:tc>
+          <w:tcPr>
+            <w:tcW w:type="dxa" w:w="2948"/>
+            <w:tcBorders>
+              <w:top w:val="single" w:sz="4" w:space="0" w:color="D5DEDE"/>
+              <w:left w:val="single" w:sz="4" w:space="0" w:color="D5DEDE"/>
+              <w:bottom w:val="single" w:sz="4" w:space="0" w:color="D5DEDE"/>
+              <w:right w:val="single" w:sz="4" w:space="0" w:color="D5DEDE"/>
+            </w:tcBorders>
+            <w:tcMar>
+              <w:top w:w="80" w:type="dxa"/>
+              <w:left w:w="80" w:type="dxa"/>
+              <w:bottom w:w="80" w:type="dxa"/>
+              <w:right w:w="80" w:type="dxa"/>
+            </w:tcMar>
+            <w:shd w:fill="F4F7F7" w:val="clear"/>
+          </w:tcPr>
+          <w:p>
+            <w:pPr>
+              <w:spacing w:before="0" w:after="0" w:line="259" w:lineRule="auto"/>
+              <w:jc w:val="left"/>
+            </w:pPr>
+            <w:r/>
+            <w:r>
+              <w:rPr>
+                <w:rFonts w:ascii="Calibri" w:hAnsi="Calibri" w:eastAsia="Calibri"/>
+                <w:b w:val="0"/>
+                <w:i w:val="0"/>
+                <w:color w:val="1A1A1A"/>
+                <w:sz w:val="21"/>
+              </w:rPr>
+              <w:t>T-bane linje 5 sørover.</w:t>
+            </w:r>
+          </w:p>
+        </w:tc>
+        <w:tc>
+          <w:tcPr>
+            <w:tcW w:type="dxa" w:w="2778"/>
+            <w:tcBorders>
+              <w:top w:val="single" w:sz="4" w:space="0" w:color="D5DEDE"/>
+              <w:left w:val="single" w:sz="4" w:space="0" w:color="D5DEDE"/>
+              <w:bottom w:val="single" w:sz="4" w:space="0" w:color="D5DEDE"/>
+              <w:right w:val="single" w:sz="4" w:space="0" w:color="D5DEDE"/>
+            </w:tcBorders>
+            <w:tcMar>
+              <w:top w:w="80" w:type="dxa"/>
+              <w:left w:w="80" w:type="dxa"/>
+              <w:bottom w:w="80" w:type="dxa"/>
+              <w:right w:w="80" w:type="dxa"/>
+            </w:tcMar>
+            <w:shd w:fill="F4F7F7" w:val="clear"/>
+          </w:tcPr>
+          <w:p>
+            <w:pPr>
+              <w:spacing w:before="0" w:after="0" w:line="259" w:lineRule="auto"/>
+              <w:jc w:val="left"/>
+            </w:pPr>
+            <w:r/>
+            <w:r>
+              <w:rPr>
+                <w:rFonts w:ascii="Calibri" w:hAnsi="Calibri" w:eastAsia="Calibri"/>
+                <w:b w:val="0"/>
+                <w:i w:val="0"/>
+                <w:color w:val="1A1A1A"/>
+                <w:sz w:val="21"/>
+              </w:rPr>
+              <w:t>123 m.</w:t>
+            </w:r>
+          </w:p>
+        </w:tc>
+      </w:tr>
+      <w:tr>
+        <w:trPr>
+          <w:cantSplit/>
+        </w:trPr>
+        <w:tc>
+          <w:tcPr>
+            <w:tcW w:type="dxa" w:w="1247"/>
+            <w:tcBorders>
+              <w:top w:val="single" w:sz="4" w:space="0" w:color="D5DEDE"/>
+              <w:left w:val="single" w:sz="4" w:space="0" w:color="D5DEDE"/>
+              <w:bottom w:val="single" w:sz="4" w:space="0" w:color="D5DEDE"/>
+              <w:right w:val="single" w:sz="4" w:space="0" w:color="D5DEDE"/>
+            </w:tcBorders>
+            <w:tcMar>
+              <w:top w:w="80" w:type="dxa"/>
+              <w:left w:w="80" w:type="dxa"/>
+              <w:bottom w:w="80" w:type="dxa"/>
+              <w:right w:w="80" w:type="dxa"/>
+            </w:tcMar>
+            <w:shd w:fill="FFFFFF" w:val="clear"/>
+          </w:tcPr>
+          <w:p>
+            <w:pPr>
+              <w:spacing w:before="0" w:after="0" w:line="259" w:lineRule="auto"/>
+              <w:jc w:val="left"/>
+            </w:pPr>
+            <w:r/>
+            <w:r>
+              <w:rPr>
+                <w:rFonts w:ascii="Calibri" w:hAnsi="Calibri" w:eastAsia="Calibri"/>
+                <w:b w:val="0"/>
+                <w:i w:val="0"/>
+                <w:color w:val="1A1A1A"/>
+                <w:sz w:val="21"/>
+              </w:rPr>
+              <w:t>5</w:t>
+            </w:r>
+          </w:p>
+        </w:tc>
+        <w:tc>
+          <w:tcPr>
+            <w:tcW w:type="dxa" w:w="2494"/>
+            <w:tcBorders>
+              <w:top w:val="single" w:sz="4" w:space="0" w:color="D5DEDE"/>
+              <w:left w:val="single" w:sz="4" w:space="0" w:color="D5DEDE"/>
+              <w:bottom w:val="single" w:sz="4" w:space="0" w:color="D5DEDE"/>
+              <w:right w:val="single" w:sz="4" w:space="0" w:color="D5DEDE"/>
+            </w:tcBorders>
+            <w:tcMar>
+              <w:top w:w="80" w:type="dxa"/>
+              <w:left w:w="80" w:type="dxa"/>
+              <w:bottom w:w="80" w:type="dxa"/>
+              <w:right w:w="80" w:type="dxa"/>
+            </w:tcMar>
+            <w:shd w:fill="FFFFFF" w:val="clear"/>
+          </w:tcPr>
+          <w:p>
+            <w:pPr>
+              <w:spacing w:before="0" w:after="0" w:line="259" w:lineRule="auto"/>
+              <w:jc w:val="left"/>
+            </w:pPr>
+            <w:r/>
+            <w:r>
+              <w:rPr>
+                <w:rFonts w:ascii="Calibri" w:hAnsi="Calibri" w:eastAsia="Calibri"/>
+                <w:b w:val="0"/>
+                <w:i w:val="0"/>
+                <w:color w:val="1A1A1A"/>
+                <w:sz w:val="21"/>
+              </w:rPr>
+              <w:t>Ullevål stadion stasjon</w:t>
+            </w:r>
+          </w:p>
+        </w:tc>
+        <w:tc>
+          <w:tcPr>
+            <w:tcW w:type="dxa" w:w="2948"/>
+            <w:tcBorders>
+              <w:top w:val="single" w:sz="4" w:space="0" w:color="D5DEDE"/>
+              <w:left w:val="single" w:sz="4" w:space="0" w:color="D5DEDE"/>
+              <w:bottom w:val="single" w:sz="4" w:space="0" w:color="D5DEDE"/>
+              <w:right w:val="single" w:sz="4" w:space="0" w:color="D5DEDE"/>
+            </w:tcBorders>
+            <w:tcMar>
+              <w:top w:w="80" w:type="dxa"/>
+              <w:left w:w="80" w:type="dxa"/>
+              <w:bottom w:w="80" w:type="dxa"/>
+              <w:right w:w="80" w:type="dxa"/>
+            </w:tcMar>
+            <w:shd w:fill="FFFFFF" w:val="clear"/>
+          </w:tcPr>
+          <w:p>
+            <w:pPr>
+              <w:spacing w:before="0" w:after="0" w:line="259" w:lineRule="auto"/>
+              <w:jc w:val="left"/>
+            </w:pPr>
+            <w:r/>
+            <w:r>
+              <w:rPr>
+                <w:rFonts w:ascii="Calibri" w:hAnsi="Calibri" w:eastAsia="Calibri"/>
+                <w:b w:val="0"/>
+                <w:i w:val="0"/>
+                <w:color w:val="1A1A1A"/>
+                <w:sz w:val="21"/>
+              </w:rPr>
+              <w:t>T-bane linje 5 sørover.</w:t>
+            </w:r>
+          </w:p>
+        </w:tc>
+        <w:tc>
+          <w:tcPr>
+            <w:tcW w:type="dxa" w:w="2778"/>
+            <w:tcBorders>
+              <w:top w:val="single" w:sz="4" w:space="0" w:color="D5DEDE"/>
+              <w:left w:val="single" w:sz="4" w:space="0" w:color="D5DEDE"/>
+              <w:bottom w:val="single" w:sz="4" w:space="0" w:color="D5DEDE"/>
+              <w:right w:val="single" w:sz="4" w:space="0" w:color="D5DEDE"/>
+            </w:tcBorders>
+            <w:tcMar>
+              <w:top w:w="80" w:type="dxa"/>
+              <w:left w:w="80" w:type="dxa"/>
+              <w:bottom w:w="80" w:type="dxa"/>
+              <w:right w:w="80" w:type="dxa"/>
+            </w:tcMar>
+            <w:shd w:fill="FFFFFF" w:val="clear"/>
+          </w:tcPr>
+          <w:p>
+            <w:pPr>
+              <w:spacing w:before="0" w:after="0" w:line="259" w:lineRule="auto"/>
+              <w:jc w:val="left"/>
+            </w:pPr>
+            <w:r/>
+            <w:r>
+              <w:rPr>
+                <w:rFonts w:ascii="Calibri" w:hAnsi="Calibri" w:eastAsia="Calibri"/>
+                <w:b w:val="0"/>
+                <w:i w:val="0"/>
+                <w:color w:val="1A1A1A"/>
+                <w:sz w:val="21"/>
+              </w:rPr>
+              <w:t>98 m.</w:t>
+            </w:r>
+          </w:p>
+        </w:tc>
+      </w:tr>
+      <w:tr>
+        <w:trPr>
+          <w:cantSplit/>
+        </w:trPr>
+        <w:tc>
+          <w:tcPr>
+            <w:tcW w:type="dxa" w:w="1247"/>
+            <w:tcBorders>
+              <w:top w:val="single" w:sz="4" w:space="0" w:color="D5DEDE"/>
+              <w:left w:val="single" w:sz="4" w:space="0" w:color="D5DEDE"/>
+              <w:bottom w:val="single" w:sz="4" w:space="0" w:color="D5DEDE"/>
+              <w:right w:val="single" w:sz="4" w:space="0" w:color="D5DEDE"/>
+            </w:tcBorders>
+            <w:tcMar>
+              <w:top w:w="80" w:type="dxa"/>
+              <w:left w:w="80" w:type="dxa"/>
+              <w:bottom w:w="80" w:type="dxa"/>
+              <w:right w:w="80" w:type="dxa"/>
+            </w:tcMar>
+            <w:shd w:fill="F4F7F7" w:val="clear"/>
+          </w:tcPr>
+          <w:p>
+            <w:pPr>
+              <w:spacing w:before="0" w:after="0" w:line="259" w:lineRule="auto"/>
+              <w:jc w:val="left"/>
+            </w:pPr>
+            <w:r/>
+            <w:r>
+              <w:rPr>
+                <w:rFonts w:ascii="Calibri" w:hAnsi="Calibri" w:eastAsia="Calibri"/>
+                <w:b w:val="0"/>
+                <w:i w:val="0"/>
+                <w:color w:val="1A1A1A"/>
+                <w:sz w:val="21"/>
+              </w:rPr>
+              <w:t>6</w:t>
+            </w:r>
+          </w:p>
+        </w:tc>
+        <w:tc>
+          <w:tcPr>
+            <w:tcW w:type="dxa" w:w="2494"/>
+            <w:tcBorders>
+              <w:top w:val="single" w:sz="4" w:space="0" w:color="D5DEDE"/>
+              <w:left w:val="single" w:sz="4" w:space="0" w:color="D5DEDE"/>
+              <w:bottom w:val="single" w:sz="4" w:space="0" w:color="D5DEDE"/>
+              <w:right w:val="single" w:sz="4" w:space="0" w:color="D5DEDE"/>
+            </w:tcBorders>
+            <w:tcMar>
+              <w:top w:w="80" w:type="dxa"/>
+              <w:left w:w="80" w:type="dxa"/>
+              <w:bottom w:w="80" w:type="dxa"/>
+              <w:right w:w="80" w:type="dxa"/>
+            </w:tcMar>
+            <w:shd w:fill="F4F7F7" w:val="clear"/>
+          </w:tcPr>
+          <w:p>
+            <w:pPr>
+              <w:spacing w:before="0" w:after="0" w:line="259" w:lineRule="auto"/>
+              <w:jc w:val="left"/>
+            </w:pPr>
+            <w:r/>
+            <w:r>
+              <w:rPr>
+                <w:rFonts w:ascii="Calibri" w:hAnsi="Calibri" w:eastAsia="Calibri"/>
+                <w:b w:val="0"/>
+                <w:i w:val="0"/>
+                <w:color w:val="1A1A1A"/>
+                <w:sz w:val="21"/>
+              </w:rPr>
+              <w:t>Blindern stasjon</w:t>
+            </w:r>
+          </w:p>
+        </w:tc>
+        <w:tc>
+          <w:tcPr>
+            <w:tcW w:type="dxa" w:w="2948"/>
+            <w:tcBorders>
+              <w:top w:val="single" w:sz="4" w:space="0" w:color="D5DEDE"/>
+              <w:left w:val="single" w:sz="4" w:space="0" w:color="D5DEDE"/>
+              <w:bottom w:val="single" w:sz="4" w:space="0" w:color="D5DEDE"/>
+              <w:right w:val="single" w:sz="4" w:space="0" w:color="D5DEDE"/>
+            </w:tcBorders>
+            <w:tcMar>
+              <w:top w:w="80" w:type="dxa"/>
+              <w:left w:w="80" w:type="dxa"/>
+              <w:bottom w:w="80" w:type="dxa"/>
+              <w:right w:w="80" w:type="dxa"/>
+            </w:tcMar>
+            <w:shd w:fill="F4F7F7" w:val="clear"/>
+          </w:tcPr>
+          <w:p>
+            <w:pPr>
+              <w:spacing w:before="0" w:after="0" w:line="259" w:lineRule="auto"/>
+              <w:jc w:val="left"/>
+            </w:pPr>
+            <w:r/>
+            <w:r>
+              <w:rPr>
+                <w:rFonts w:ascii="Calibri" w:hAnsi="Calibri" w:eastAsia="Calibri"/>
+                <w:b w:val="0"/>
+                <w:i w:val="0"/>
+                <w:color w:val="1A1A1A"/>
+                <w:sz w:val="21"/>
+              </w:rPr>
+              <w:t>T-bane linje 5 sørover.</w:t>
+            </w:r>
+          </w:p>
+        </w:tc>
+        <w:tc>
+          <w:tcPr>
+            <w:tcW w:type="dxa" w:w="2778"/>
+            <w:tcBorders>
+              <w:top w:val="single" w:sz="4" w:space="0" w:color="D5DEDE"/>
+              <w:left w:val="single" w:sz="4" w:space="0" w:color="D5DEDE"/>
+              <w:bottom w:val="single" w:sz="4" w:space="0" w:color="D5DEDE"/>
+              <w:right w:val="single" w:sz="4" w:space="0" w:color="D5DEDE"/>
+            </w:tcBorders>
+            <w:tcMar>
+              <w:top w:w="80" w:type="dxa"/>
+              <w:left w:w="80" w:type="dxa"/>
+              <w:bottom w:w="80" w:type="dxa"/>
+              <w:right w:w="80" w:type="dxa"/>
+            </w:tcMar>
+            <w:shd w:fill="F4F7F7" w:val="clear"/>
+          </w:tcPr>
+          <w:p>
+            <w:pPr>
+              <w:spacing w:before="0" w:after="0" w:line="259" w:lineRule="auto"/>
+              <w:jc w:val="left"/>
+            </w:pPr>
+            <w:r/>
+            <w:r>
+              <w:rPr>
+                <w:rFonts w:ascii="Calibri" w:hAnsi="Calibri" w:eastAsia="Calibri"/>
+                <w:b w:val="0"/>
+                <w:i w:val="0"/>
+                <w:color w:val="1A1A1A"/>
+                <w:sz w:val="21"/>
+              </w:rPr>
+              <w:t>75 m.</w:t>
+            </w:r>
+          </w:p>
+        </w:tc>
+      </w:tr>
+    </w:tbl>
+    <w:p/>
+    <w:p>
+      <w:pPr>
+        <w:spacing w:before="0" w:after="160" w:line="276" w:lineRule="auto"/>
+      </w:pPr>
+      <w:r>
+        <w:rPr>
+          <w:rFonts w:ascii="Calibri" w:hAnsi="Calibri" w:eastAsia="Calibri"/>
+          <w:b w:val="0"/>
+          <w:i w:val="0"/>
+          <w:color w:val="1A1A1A"/>
+          <w:sz w:val="22"/>
+        </w:rPr>
+        <w:t>Har klassen bare fire grupper, tar de Sognsvann, Tåsen, Ullevål stadion og Blindern. Da er målingene et snitt nord–sør. Isobarene tegnes på tvers av det snittet, der tallene gir grunnlag for det.</w:t>
+      </w:r>
+    </w:p>
+    <w:p>
+      <w:pPr>
+        <w:spacing w:before="0" w:after="160" w:line="276" w:lineRule="auto"/>
+      </w:pPr>
+      <w:r>
+        <w:rPr>
+          <w:rFonts w:ascii="Calibri" w:hAnsi="Calibri" w:eastAsia="Calibri"/>
+          <w:b w:val="0"/>
+          <w:i w:val="0"/>
+          <w:color w:val="1A1A1A"/>
+          <w:sz w:val="22"/>
+        </w:rPr>
+        <w:t>Avtalt klokkeslett er 40 minutter etter at gruppene har skilt lag, så gruppen til Vetakolltoppen rekker fram. De andre venter ute ved punktet sitt til minuttet.</w:t>
+      </w:r>
+    </w:p>
+    <w:p>
+      <w:pPr>
+        <w:spacing w:before="0" w:after="80" w:line="276" w:lineRule="auto"/>
+      </w:pPr>
+      <w:r>
+        <w:rPr>
+          <w:rFonts w:ascii="Calibri" w:hAnsi="Calibri" w:eastAsia="Calibri"/>
+          <w:b/>
+          <w:i w:val="0"/>
+          <w:color w:val="1A1A1A"/>
+          <w:sz w:val="22"/>
+        </w:rPr>
+        <w:t>Omregning til havnivå</w:t>
+      </w:r>
+    </w:p>
+    <w:p>
+      <w:pPr>
+        <w:spacing w:before="0" w:after="160" w:line="276" w:lineRule="auto"/>
+      </w:pPr>
+      <w:r>
+        <w:rPr>
+          <w:rFonts w:ascii="Calibri" w:hAnsi="Calibri" w:eastAsia="Calibri"/>
+          <w:b w:val="0"/>
+          <w:i w:val="0"/>
+          <w:color w:val="1A1A1A"/>
+          <w:sz w:val="22"/>
+        </w:rPr>
+        <w:t>Isobarene på værkartet er trykk redusert til havnivå. Telefonen måler trykket der dere står. Nær bakken faller trykket med om lag 1 hPa per 8 meter.</w:t>
+      </w:r>
+    </w:p>
+    <w:p>
+      <w:pPr>
+        <w:spacing w:before="0" w:after="160" w:line="276" w:lineRule="auto"/>
+      </w:pPr>
+      <w:r>
+        <w:rPr>
+          <w:rFonts w:ascii="Calibri" w:hAnsi="Calibri" w:eastAsia="Calibri"/>
+          <w:b/>
+          <w:i w:val="0"/>
+          <w:color w:val="1A1A1A"/>
+          <w:sz w:val="22"/>
+        </w:rPr>
+        <w:t xml:space="preserve">Havnivåtrykk = korrigert telefontrykk + høyde / 8. </w:t>
+      </w:r>
+      <w:r>
+        <w:rPr>
+          <w:rFonts w:ascii="Calibri" w:hAnsi="Calibri" w:eastAsia="Calibri"/>
+          <w:b w:val="0"/>
+          <w:i w:val="0"/>
+          <w:color w:val="1A1A1A"/>
+          <w:sz w:val="22"/>
+        </w:rPr>
+        <w:t>Eksempel: 980,0 hPa på Sognsvann stasjon, 198 m, gir 980,0 + 198/8 = 980,0 + 24,8 = 1004,8 hPa.</w:t>
+      </w:r>
+    </w:p>
+    <w:p>
+      <w:pPr>
+        <w:spacing w:before="0" w:after="160" w:line="276" w:lineRule="auto"/>
+      </w:pPr>
+      <w:r>
+        <w:rPr>
+          <w:rFonts w:ascii="Calibri" w:hAnsi="Calibri" w:eastAsia="Calibri"/>
+          <w:b w:val="0"/>
+          <w:i w:val="0"/>
+          <w:color w:val="1A1A1A"/>
+          <w:sz w:val="22"/>
+        </w:rPr>
+        <w:t>Høyden tas fra tabellen, eller fra koten på kartet der dere faktisk står. Telefonens egen høydemåler brukes ikke. Den bommer ofte med titalls meter.</w:t>
+      </w:r>
+    </w:p>
+    <w:p>
+      <w:pPr>
+        <w:spacing w:before="0" w:after="80" w:line="276" w:lineRule="auto"/>
+      </w:pPr>
+      <w:r>
+        <w:rPr>
+          <w:rFonts w:ascii="Calibri" w:hAnsi="Calibri" w:eastAsia="Calibri"/>
+          <w:b/>
+          <w:i w:val="0"/>
+          <w:color w:val="1A1A1A"/>
+          <w:sz w:val="22"/>
+        </w:rPr>
+        <w:t>Slik tegnes isobarene</w:t>
+      </w:r>
+    </w:p>
+    <w:p>
+      <w:pPr>
+        <w:pStyle w:val="ListBullet"/>
+        <w:spacing w:before="20" w:after="40" w:line="269" w:lineRule="auto"/>
+      </w:pPr>
+      <w:r>
+        <w:rPr>
+          <w:rFonts w:ascii="Calibri" w:hAnsi="Calibri" w:eastAsia="Calibri"/>
+          <w:b w:val="0"/>
+          <w:i w:val="0"/>
+          <w:color w:val="1A1A1A"/>
+          <w:sz w:val="22"/>
+        </w:rPr>
+        <w:t>På et kart som dekker Vetakolltoppen til Blindern skriver dere havnivåtrykket ved hvert punkt.</w:t>
+      </w:r>
+    </w:p>
+    <w:p>
+      <w:pPr>
+        <w:pStyle w:val="ListBullet"/>
+        <w:spacing w:before="20" w:after="40" w:line="269" w:lineRule="auto"/>
+      </w:pPr>
+      <w:r>
+        <w:rPr>
+          <w:rFonts w:ascii="Calibri" w:hAnsi="Calibri" w:eastAsia="Calibri"/>
+          <w:b w:val="0"/>
+          <w:i w:val="0"/>
+          <w:color w:val="1A1A1A"/>
+          <w:sz w:val="22"/>
+        </w:rPr>
+        <w:t>Velg intervall 1 hPa hvis spennet i tallene er over 2 hPa. Er spennet mindre, bruk 0,5 hPa.</w:t>
+      </w:r>
+    </w:p>
+    <w:p>
+      <w:pPr>
+        <w:pStyle w:val="ListBullet"/>
+        <w:spacing w:before="20" w:after="40" w:line="269" w:lineRule="auto"/>
+      </w:pPr>
+      <w:r>
+        <w:rPr>
+          <w:rFonts w:ascii="Calibri" w:hAnsi="Calibri" w:eastAsia="Calibri"/>
+          <w:b w:val="0"/>
+          <w:i w:val="0"/>
+          <w:color w:val="1A1A1A"/>
+          <w:sz w:val="22"/>
+        </w:rPr>
+        <w:t>Trekk linjer gjennom like verdier. Linjene krysser ikke. Der to nabopunkt skiller mindre enn intervallet, tegnes ingen linje mellom dem.</w:t>
+      </w:r>
+    </w:p>
+    <w:p>
+      <w:pPr>
+        <w:pStyle w:val="ListBullet"/>
+        <w:spacing w:before="20" w:after="40" w:line="269" w:lineRule="auto"/>
+      </w:pPr>
+      <w:r>
+        <w:rPr>
+          <w:rFonts w:ascii="Calibri" w:hAnsi="Calibri" w:eastAsia="Calibri"/>
+          <w:b w:val="0"/>
+          <w:i w:val="0"/>
+          <w:color w:val="1A1A1A"/>
+          <w:sz w:val="22"/>
+        </w:rPr>
+        <w:t>Ikke tegn buer der dere ikke har et punkt.</w:t>
+      </w:r>
+    </w:p>
+    <w:p>
+      <w:pPr>
+        <w:spacing w:before="0" w:after="160" w:line="276" w:lineRule="auto"/>
+      </w:pPr>
+      <w:r>
+        <w:rPr>
+          <w:rFonts w:ascii="Calibri" w:hAnsi="Calibri" w:eastAsia="Calibri"/>
+          <w:b w:val="0"/>
+          <w:i w:val="0"/>
+          <w:color w:val="1A1A1A"/>
+          <w:sz w:val="22"/>
+        </w:rPr>
+        <w:t>Sammenlign med analysenkartet fra formiddagen. Faller trykket samme vei, og er linjene like tette? Vinden går langs isobarene, med lavtrykk til venstre.</w:t>
+      </w:r>
+    </w:p>
+    <w:p>
+      <w:pPr>
+        <w:spacing w:before="0" w:after="160" w:line="276" w:lineRule="auto"/>
+      </w:pPr>
+      <w:r>
+        <w:rPr>
+          <w:rFonts w:ascii="Calibri" w:hAnsi="Calibri" w:eastAsia="Calibri"/>
+          <w:b w:val="0"/>
+          <w:i w:val="0"/>
+          <w:color w:val="1A1A1A"/>
+          <w:sz w:val="22"/>
+        </w:rPr>
+        <w:t>Uten høydekorreksjon vil linjene følge bakken: lavere tall på Vetakolltoppen enn på Blindern, selv om været er det samme. Det kartet viser terrenget. Havnivåkartet er det som kan sammenlignes med værkartet.</w:t>
+      </w:r>
+    </w:p>
+    <w:p>
+      <w:pPr>
+        <w:pStyle w:val="Heading1"/>
+        <w:spacing w:before="320" w:after="120"/>
+      </w:pPr>
+      <w:r>
+        <w:rPr>
+          <w:rFonts w:ascii="Calibri" w:hAnsi="Calibri" w:eastAsia="Calibri"/>
+          <w:b/>
+          <w:i w:val="0"/>
+          <w:color w:val="1B3A4B"/>
+          <w:sz w:val="32"/>
+        </w:rPr>
         <w:t>HMS</w:t>
       </w:r>
     </w:p>
@@ -3447,7 +4844,39 @@
           <w:color w:val="1A1A1A"/>
           <w:sz w:val="22"/>
         </w:rPr>
-        <w:t>Hold dere på grusstien. Det ligger gamle gruver i åsen vest for vannet.</w:t>
+        <w:t>Hold dere på grusstien rundt vannet. Det ligger gamle gruver i åsen vest for vannet.</w:t>
+      </w:r>
+    </w:p>
+    <w:p>
+      <w:pPr>
+        <w:pStyle w:val="ListBullet"/>
+        <w:spacing w:before="20" w:after="40" w:line="269" w:lineRule="auto"/>
+      </w:pPr>
+      <w:r>
+        <w:rPr>
+          <w:rFonts w:ascii="Calibri" w:hAnsi="Calibri" w:eastAsia="Calibri"/>
+          <w:b w:val="0"/>
+          <w:i w:val="0"/>
+          <w:color w:val="1A1A1A"/>
+          <w:sz w:val="22"/>
+        </w:rPr>
+        <w:t>T-banen: mål ute på stasjonen, ikke i vognen. Gruppen holder sammen og har billett.</w:t>
+      </w:r>
+    </w:p>
+    <w:p>
+      <w:pPr>
+        <w:pStyle w:val="ListBullet"/>
+        <w:spacing w:before="20" w:after="40" w:line="269" w:lineRule="auto"/>
+      </w:pPr>
+      <w:r>
+        <w:rPr>
+          <w:rFonts w:ascii="Calibri" w:hAnsi="Calibri" w:eastAsia="Calibri"/>
+          <w:b w:val="0"/>
+          <w:i w:val="0"/>
+          <w:color w:val="1A1A1A"/>
+          <w:sz w:val="22"/>
+        </w:rPr>
+        <w:t>Vetakolltoppen er bratt. Gruppen snur hvis stien er glatt eller de ikke rekker minuttet, og måler da på et lavere punkt der koten er kjent.</w:t>
       </w:r>
     </w:p>
     <w:p>
@@ -6346,6 +7775,2305 @@
           <w:color w:val="1A1A1A"/>
           <w:sz w:val="22"/>
         </w:rPr>
+        <w:t>Isobarer. Én rad per punkt. Havnivåtrykk = korrigert trykk + høyde / 8.</w:t>
+      </w:r>
+    </w:p>
+    <w:tbl>
+      <w:tblPr>
+        <w:tblW w:type="auto" w:w="0"/>
+        <w:jc w:val="center"/>
+        <w:tblLayout w:type="fixed"/>
+        <w:tblLook w:firstColumn="1" w:firstRow="1" w:lastColumn="0" w:lastRow="0" w:noHBand="0" w:noVBand="1" w:val="04A0"/>
+        <w:tblW w:w="9468" w:type="dxa"/>
+        <w:tblLayout w:type="fixed"/>
+      </w:tblPr>
+      <w:tblGrid>
+        <w:gridCol w:w="1377"/>
+        <w:gridCol w:w="1377"/>
+        <w:gridCol w:w="1377"/>
+        <w:gridCol w:w="1377"/>
+        <w:gridCol w:w="1377"/>
+        <w:gridCol w:w="1377"/>
+        <w:gridCol w:w="1377"/>
+      </w:tblGrid>
+      <w:tr>
+        <w:trPr>
+          <w:cantSplit/>
+        </w:trPr>
+        <w:tc>
+          <w:tcPr>
+            <w:tcW w:type="dxa" w:w="1928"/>
+            <w:tcBorders>
+              <w:top w:val="single" w:sz="4" w:space="0" w:color="D5DEDE"/>
+              <w:left w:val="single" w:sz="4" w:space="0" w:color="D5DEDE"/>
+              <w:bottom w:val="single" w:sz="4" w:space="0" w:color="D5DEDE"/>
+              <w:right w:val="single" w:sz="4" w:space="0" w:color="D5DEDE"/>
+            </w:tcBorders>
+            <w:tcMar>
+              <w:top w:w="80" w:type="dxa"/>
+              <w:left w:w="80" w:type="dxa"/>
+              <w:bottom w:w="80" w:type="dxa"/>
+              <w:right w:w="80" w:type="dxa"/>
+            </w:tcMar>
+            <w:shd w:fill="1B3A4B" w:val="clear"/>
+          </w:tcPr>
+          <w:p>
+            <w:pPr>
+              <w:spacing w:before="0" w:after="0" w:line="259" w:lineRule="auto"/>
+              <w:jc w:val="left"/>
+            </w:pPr>
+            <w:r/>
+            <w:r>
+              <w:rPr>
+                <w:rFonts w:ascii="Calibri" w:hAnsi="Calibri" w:eastAsia="Calibri"/>
+                <w:b/>
+                <w:i w:val="0"/>
+                <w:color w:val="FFFFFF"/>
+                <w:sz w:val="21"/>
+              </w:rPr>
+              <w:t>Punkt</w:t>
+            </w:r>
+          </w:p>
+        </w:tc>
+        <w:tc>
+          <w:tcPr>
+            <w:tcW w:type="dxa" w:w="907"/>
+            <w:tcBorders>
+              <w:top w:val="single" w:sz="4" w:space="0" w:color="D5DEDE"/>
+              <w:left w:val="single" w:sz="4" w:space="0" w:color="D5DEDE"/>
+              <w:bottom w:val="single" w:sz="4" w:space="0" w:color="D5DEDE"/>
+              <w:right w:val="single" w:sz="4" w:space="0" w:color="D5DEDE"/>
+            </w:tcBorders>
+            <w:tcMar>
+              <w:top w:w="80" w:type="dxa"/>
+              <w:left w:w="80" w:type="dxa"/>
+              <w:bottom w:w="80" w:type="dxa"/>
+              <w:right w:w="80" w:type="dxa"/>
+            </w:tcMar>
+            <w:shd w:fill="1B3A4B" w:val="clear"/>
+          </w:tcPr>
+          <w:p>
+            <w:pPr>
+              <w:spacing w:before="0" w:after="0" w:line="259" w:lineRule="auto"/>
+              <w:jc w:val="left"/>
+            </w:pPr>
+            <w:r/>
+            <w:r>
+              <w:rPr>
+                <w:rFonts w:ascii="Calibri" w:hAnsi="Calibri" w:eastAsia="Calibri"/>
+                <w:b/>
+                <w:i w:val="0"/>
+                <w:color w:val="FFFFFF"/>
+                <w:sz w:val="21"/>
+              </w:rPr>
+              <w:t>Kl.</w:t>
+            </w:r>
+          </w:p>
+        </w:tc>
+        <w:tc>
+          <w:tcPr>
+            <w:tcW w:type="dxa" w:w="1304"/>
+            <w:tcBorders>
+              <w:top w:val="single" w:sz="4" w:space="0" w:color="D5DEDE"/>
+              <w:left w:val="single" w:sz="4" w:space="0" w:color="D5DEDE"/>
+              <w:bottom w:val="single" w:sz="4" w:space="0" w:color="D5DEDE"/>
+              <w:right w:val="single" w:sz="4" w:space="0" w:color="D5DEDE"/>
+            </w:tcBorders>
+            <w:tcMar>
+              <w:top w:w="80" w:type="dxa"/>
+              <w:left w:w="80" w:type="dxa"/>
+              <w:bottom w:w="80" w:type="dxa"/>
+              <w:right w:w="80" w:type="dxa"/>
+            </w:tcMar>
+            <w:shd w:fill="1B3A4B" w:val="clear"/>
+          </w:tcPr>
+          <w:p>
+            <w:pPr>
+              <w:spacing w:before="0" w:after="0" w:line="259" w:lineRule="auto"/>
+              <w:jc w:val="left"/>
+            </w:pPr>
+            <w:r/>
+            <w:r>
+              <w:rPr>
+                <w:rFonts w:ascii="Calibri" w:hAnsi="Calibri" w:eastAsia="Calibri"/>
+                <w:b/>
+                <w:i w:val="0"/>
+                <w:color w:val="FFFFFF"/>
+                <w:sz w:val="21"/>
+              </w:rPr>
+              <w:t>Telefon</w:t>
+            </w:r>
+          </w:p>
+        </w:tc>
+        <w:tc>
+          <w:tcPr>
+            <w:tcW w:type="dxa" w:w="1020"/>
+            <w:tcBorders>
+              <w:top w:val="single" w:sz="4" w:space="0" w:color="D5DEDE"/>
+              <w:left w:val="single" w:sz="4" w:space="0" w:color="D5DEDE"/>
+              <w:bottom w:val="single" w:sz="4" w:space="0" w:color="D5DEDE"/>
+              <w:right w:val="single" w:sz="4" w:space="0" w:color="D5DEDE"/>
+            </w:tcBorders>
+            <w:tcMar>
+              <w:top w:w="80" w:type="dxa"/>
+              <w:left w:w="80" w:type="dxa"/>
+              <w:bottom w:w="80" w:type="dxa"/>
+              <w:right w:w="80" w:type="dxa"/>
+            </w:tcMar>
+            <w:shd w:fill="1B3A4B" w:val="clear"/>
+          </w:tcPr>
+          <w:p>
+            <w:pPr>
+              <w:spacing w:before="0" w:after="0" w:line="259" w:lineRule="auto"/>
+              <w:jc w:val="left"/>
+            </w:pPr>
+            <w:r/>
+            <w:r>
+              <w:rPr>
+                <w:rFonts w:ascii="Calibri" w:hAnsi="Calibri" w:eastAsia="Calibri"/>
+                <w:b/>
+                <w:i w:val="0"/>
+                <w:color w:val="FFFFFF"/>
+                <w:sz w:val="21"/>
+              </w:rPr>
+              <w:t>Avvik</w:t>
+            </w:r>
+          </w:p>
+        </w:tc>
+        <w:tc>
+          <w:tcPr>
+            <w:tcW w:type="dxa" w:w="1361"/>
+            <w:tcBorders>
+              <w:top w:val="single" w:sz="4" w:space="0" w:color="D5DEDE"/>
+              <w:left w:val="single" w:sz="4" w:space="0" w:color="D5DEDE"/>
+              <w:bottom w:val="single" w:sz="4" w:space="0" w:color="D5DEDE"/>
+              <w:right w:val="single" w:sz="4" w:space="0" w:color="D5DEDE"/>
+            </w:tcBorders>
+            <w:tcMar>
+              <w:top w:w="80" w:type="dxa"/>
+              <w:left w:w="80" w:type="dxa"/>
+              <w:bottom w:w="80" w:type="dxa"/>
+              <w:right w:w="80" w:type="dxa"/>
+            </w:tcMar>
+            <w:shd w:fill="1B3A4B" w:val="clear"/>
+          </w:tcPr>
+          <w:p>
+            <w:pPr>
+              <w:spacing w:before="0" w:after="0" w:line="259" w:lineRule="auto"/>
+              <w:jc w:val="left"/>
+            </w:pPr>
+            <w:r/>
+            <w:r>
+              <w:rPr>
+                <w:rFonts w:ascii="Calibri" w:hAnsi="Calibri" w:eastAsia="Calibri"/>
+                <w:b/>
+                <w:i w:val="0"/>
+                <w:color w:val="FFFFFF"/>
+                <w:sz w:val="21"/>
+              </w:rPr>
+              <w:t>Korrigert</w:t>
+            </w:r>
+          </w:p>
+        </w:tc>
+        <w:tc>
+          <w:tcPr>
+            <w:tcW w:type="dxa" w:w="1134"/>
+            <w:tcBorders>
+              <w:top w:val="single" w:sz="4" w:space="0" w:color="D5DEDE"/>
+              <w:left w:val="single" w:sz="4" w:space="0" w:color="D5DEDE"/>
+              <w:bottom w:val="single" w:sz="4" w:space="0" w:color="D5DEDE"/>
+              <w:right w:val="single" w:sz="4" w:space="0" w:color="D5DEDE"/>
+            </w:tcBorders>
+            <w:tcMar>
+              <w:top w:w="80" w:type="dxa"/>
+              <w:left w:w="80" w:type="dxa"/>
+              <w:bottom w:w="80" w:type="dxa"/>
+              <w:right w:w="80" w:type="dxa"/>
+            </w:tcMar>
+            <w:shd w:fill="1B3A4B" w:val="clear"/>
+          </w:tcPr>
+          <w:p>
+            <w:pPr>
+              <w:spacing w:before="0" w:after="0" w:line="259" w:lineRule="auto"/>
+              <w:jc w:val="left"/>
+            </w:pPr>
+            <w:r/>
+            <w:r>
+              <w:rPr>
+                <w:rFonts w:ascii="Calibri" w:hAnsi="Calibri" w:eastAsia="Calibri"/>
+                <w:b/>
+                <w:i w:val="0"/>
+                <w:color w:val="FFFFFF"/>
+                <w:sz w:val="21"/>
+              </w:rPr>
+              <w:t>Høyde m</w:t>
+            </w:r>
+          </w:p>
+        </w:tc>
+        <w:tc>
+          <w:tcPr>
+            <w:tcW w:type="dxa" w:w="1814"/>
+            <w:tcBorders>
+              <w:top w:val="single" w:sz="4" w:space="0" w:color="D5DEDE"/>
+              <w:left w:val="single" w:sz="4" w:space="0" w:color="D5DEDE"/>
+              <w:bottom w:val="single" w:sz="4" w:space="0" w:color="D5DEDE"/>
+              <w:right w:val="single" w:sz="4" w:space="0" w:color="D5DEDE"/>
+            </w:tcBorders>
+            <w:tcMar>
+              <w:top w:w="80" w:type="dxa"/>
+              <w:left w:w="80" w:type="dxa"/>
+              <w:bottom w:w="80" w:type="dxa"/>
+              <w:right w:w="80" w:type="dxa"/>
+            </w:tcMar>
+            <w:shd w:fill="1B3A4B" w:val="clear"/>
+          </w:tcPr>
+          <w:p>
+            <w:pPr>
+              <w:spacing w:before="0" w:after="0" w:line="259" w:lineRule="auto"/>
+              <w:jc w:val="left"/>
+            </w:pPr>
+            <w:r/>
+            <w:r>
+              <w:rPr>
+                <w:rFonts w:ascii="Calibri" w:hAnsi="Calibri" w:eastAsia="Calibri"/>
+                <w:b/>
+                <w:i w:val="0"/>
+                <w:color w:val="FFFFFF"/>
+                <w:sz w:val="21"/>
+              </w:rPr>
+              <w:t>Havnivå</w:t>
+            </w:r>
+          </w:p>
+        </w:tc>
+      </w:tr>
+      <w:tr>
+        <w:trPr>
+          <w:cantSplit/>
+          <w:trHeight w:val="595" w:hRule="atLeast"/>
+        </w:trPr>
+        <w:tc>
+          <w:tcPr>
+            <w:tcW w:type="dxa" w:w="1928"/>
+            <w:tcBorders>
+              <w:top w:val="single" w:sz="4" w:space="0" w:color="D5DEDE"/>
+              <w:left w:val="single" w:sz="4" w:space="0" w:color="D5DEDE"/>
+              <w:bottom w:val="single" w:sz="4" w:space="0" w:color="D5DEDE"/>
+              <w:right w:val="single" w:sz="4" w:space="0" w:color="D5DEDE"/>
+            </w:tcBorders>
+            <w:tcMar>
+              <w:top w:w="80" w:type="dxa"/>
+              <w:left w:w="80" w:type="dxa"/>
+              <w:bottom w:w="80" w:type="dxa"/>
+              <w:right w:w="80" w:type="dxa"/>
+            </w:tcMar>
+            <w:shd w:fill="FFFFFF" w:val="clear"/>
+          </w:tcPr>
+          <w:p>
+            <w:pPr>
+              <w:spacing w:before="0" w:after="0" w:line="259" w:lineRule="auto"/>
+              <w:jc w:val="left"/>
+            </w:pPr>
+            <w:r/>
+            <w:r>
+              <w:rPr>
+                <w:rFonts w:ascii="Calibri" w:hAnsi="Calibri" w:eastAsia="Calibri"/>
+                <w:b w:val="0"/>
+                <w:i w:val="0"/>
+                <w:color w:val="1A1A1A"/>
+                <w:sz w:val="21"/>
+              </w:rPr>
+              <w:t>Vetakolltoppen</w:t>
+            </w:r>
+          </w:p>
+        </w:tc>
+        <w:tc>
+          <w:tcPr>
+            <w:tcW w:type="dxa" w:w="907"/>
+            <w:tcBorders>
+              <w:top w:val="single" w:sz="4" w:space="0" w:color="D5DEDE"/>
+              <w:left w:val="single" w:sz="4" w:space="0" w:color="D5DEDE"/>
+              <w:bottom w:val="single" w:sz="4" w:space="0" w:color="D5DEDE"/>
+              <w:right w:val="single" w:sz="4" w:space="0" w:color="D5DEDE"/>
+            </w:tcBorders>
+            <w:tcMar>
+              <w:top w:w="80" w:type="dxa"/>
+              <w:left w:w="80" w:type="dxa"/>
+              <w:bottom w:w="80" w:type="dxa"/>
+              <w:right w:w="80" w:type="dxa"/>
+            </w:tcMar>
+            <w:shd w:fill="FFFFFF" w:val="clear"/>
+          </w:tcPr>
+          <w:p>
+            <w:pPr>
+              <w:spacing w:before="0" w:after="0" w:line="259" w:lineRule="auto"/>
+              <w:jc w:val="left"/>
+            </w:pPr>
+            <w:r/>
+            <w:r>
+              <w:rPr>
+                <w:rFonts w:ascii="Calibri" w:hAnsi="Calibri" w:eastAsia="Calibri"/>
+                <w:b w:val="0"/>
+                <w:i w:val="0"/>
+                <w:color w:val="1A1A1A"/>
+                <w:sz w:val="21"/>
+              </w:rPr>
+            </w:r>
+          </w:p>
+        </w:tc>
+        <w:tc>
+          <w:tcPr>
+            <w:tcW w:type="dxa" w:w="1304"/>
+            <w:tcBorders>
+              <w:top w:val="single" w:sz="4" w:space="0" w:color="D5DEDE"/>
+              <w:left w:val="single" w:sz="4" w:space="0" w:color="D5DEDE"/>
+              <w:bottom w:val="single" w:sz="4" w:space="0" w:color="D5DEDE"/>
+              <w:right w:val="single" w:sz="4" w:space="0" w:color="D5DEDE"/>
+            </w:tcBorders>
+            <w:tcMar>
+              <w:top w:w="80" w:type="dxa"/>
+              <w:left w:w="80" w:type="dxa"/>
+              <w:bottom w:w="80" w:type="dxa"/>
+              <w:right w:w="80" w:type="dxa"/>
+            </w:tcMar>
+            <w:shd w:fill="FFFFFF" w:val="clear"/>
+          </w:tcPr>
+          <w:p>
+            <w:pPr>
+              <w:spacing w:before="0" w:after="0" w:line="259" w:lineRule="auto"/>
+              <w:jc w:val="left"/>
+            </w:pPr>
+            <w:r/>
+            <w:r>
+              <w:rPr>
+                <w:rFonts w:ascii="Calibri" w:hAnsi="Calibri" w:eastAsia="Calibri"/>
+                <w:b w:val="0"/>
+                <w:i w:val="0"/>
+                <w:color w:val="1A1A1A"/>
+                <w:sz w:val="21"/>
+              </w:rPr>
+            </w:r>
+          </w:p>
+        </w:tc>
+        <w:tc>
+          <w:tcPr>
+            <w:tcW w:type="dxa" w:w="1020"/>
+            <w:tcBorders>
+              <w:top w:val="single" w:sz="4" w:space="0" w:color="D5DEDE"/>
+              <w:left w:val="single" w:sz="4" w:space="0" w:color="D5DEDE"/>
+              <w:bottom w:val="single" w:sz="4" w:space="0" w:color="D5DEDE"/>
+              <w:right w:val="single" w:sz="4" w:space="0" w:color="D5DEDE"/>
+            </w:tcBorders>
+            <w:tcMar>
+              <w:top w:w="80" w:type="dxa"/>
+              <w:left w:w="80" w:type="dxa"/>
+              <w:bottom w:w="80" w:type="dxa"/>
+              <w:right w:w="80" w:type="dxa"/>
+            </w:tcMar>
+            <w:shd w:fill="FFFFFF" w:val="clear"/>
+          </w:tcPr>
+          <w:p>
+            <w:pPr>
+              <w:spacing w:before="0" w:after="0" w:line="259" w:lineRule="auto"/>
+              <w:jc w:val="left"/>
+            </w:pPr>
+            <w:r/>
+            <w:r>
+              <w:rPr>
+                <w:rFonts w:ascii="Calibri" w:hAnsi="Calibri" w:eastAsia="Calibri"/>
+                <w:b w:val="0"/>
+                <w:i w:val="0"/>
+                <w:color w:val="1A1A1A"/>
+                <w:sz w:val="21"/>
+              </w:rPr>
+            </w:r>
+          </w:p>
+        </w:tc>
+        <w:tc>
+          <w:tcPr>
+            <w:tcW w:type="dxa" w:w="1361"/>
+            <w:tcBorders>
+              <w:top w:val="single" w:sz="4" w:space="0" w:color="D5DEDE"/>
+              <w:left w:val="single" w:sz="4" w:space="0" w:color="D5DEDE"/>
+              <w:bottom w:val="single" w:sz="4" w:space="0" w:color="D5DEDE"/>
+              <w:right w:val="single" w:sz="4" w:space="0" w:color="D5DEDE"/>
+            </w:tcBorders>
+            <w:tcMar>
+              <w:top w:w="80" w:type="dxa"/>
+              <w:left w:w="80" w:type="dxa"/>
+              <w:bottom w:w="80" w:type="dxa"/>
+              <w:right w:w="80" w:type="dxa"/>
+            </w:tcMar>
+            <w:shd w:fill="FFFFFF" w:val="clear"/>
+          </w:tcPr>
+          <w:p>
+            <w:pPr>
+              <w:spacing w:before="0" w:after="0" w:line="259" w:lineRule="auto"/>
+              <w:jc w:val="left"/>
+            </w:pPr>
+            <w:r/>
+            <w:r>
+              <w:rPr>
+                <w:rFonts w:ascii="Calibri" w:hAnsi="Calibri" w:eastAsia="Calibri"/>
+                <w:b w:val="0"/>
+                <w:i w:val="0"/>
+                <w:color w:val="1A1A1A"/>
+                <w:sz w:val="21"/>
+              </w:rPr>
+            </w:r>
+          </w:p>
+        </w:tc>
+        <w:tc>
+          <w:tcPr>
+            <w:tcW w:type="dxa" w:w="1134"/>
+            <w:tcBorders>
+              <w:top w:val="single" w:sz="4" w:space="0" w:color="D5DEDE"/>
+              <w:left w:val="single" w:sz="4" w:space="0" w:color="D5DEDE"/>
+              <w:bottom w:val="single" w:sz="4" w:space="0" w:color="D5DEDE"/>
+              <w:right w:val="single" w:sz="4" w:space="0" w:color="D5DEDE"/>
+            </w:tcBorders>
+            <w:tcMar>
+              <w:top w:w="80" w:type="dxa"/>
+              <w:left w:w="80" w:type="dxa"/>
+              <w:bottom w:w="80" w:type="dxa"/>
+              <w:right w:w="80" w:type="dxa"/>
+            </w:tcMar>
+            <w:shd w:fill="FFFFFF" w:val="clear"/>
+          </w:tcPr>
+          <w:p>
+            <w:pPr>
+              <w:spacing w:before="0" w:after="0" w:line="259" w:lineRule="auto"/>
+              <w:jc w:val="left"/>
+            </w:pPr>
+            <w:r/>
+            <w:r>
+              <w:rPr>
+                <w:rFonts w:ascii="Calibri" w:hAnsi="Calibri" w:eastAsia="Calibri"/>
+                <w:b w:val="0"/>
+                <w:i w:val="0"/>
+                <w:color w:val="1A1A1A"/>
+                <w:sz w:val="21"/>
+              </w:rPr>
+              <w:t>419</w:t>
+            </w:r>
+          </w:p>
+        </w:tc>
+        <w:tc>
+          <w:tcPr>
+            <w:tcW w:type="dxa" w:w="1814"/>
+            <w:tcBorders>
+              <w:top w:val="single" w:sz="4" w:space="0" w:color="D5DEDE"/>
+              <w:left w:val="single" w:sz="4" w:space="0" w:color="D5DEDE"/>
+              <w:bottom w:val="single" w:sz="4" w:space="0" w:color="D5DEDE"/>
+              <w:right w:val="single" w:sz="4" w:space="0" w:color="D5DEDE"/>
+            </w:tcBorders>
+            <w:tcMar>
+              <w:top w:w="80" w:type="dxa"/>
+              <w:left w:w="80" w:type="dxa"/>
+              <w:bottom w:w="80" w:type="dxa"/>
+              <w:right w:w="80" w:type="dxa"/>
+            </w:tcMar>
+            <w:shd w:fill="FFFFFF" w:val="clear"/>
+          </w:tcPr>
+          <w:p>
+            <w:pPr>
+              <w:spacing w:before="0" w:after="0" w:line="259" w:lineRule="auto"/>
+              <w:jc w:val="left"/>
+            </w:pPr>
+            <w:r/>
+            <w:r>
+              <w:rPr>
+                <w:rFonts w:ascii="Calibri" w:hAnsi="Calibri" w:eastAsia="Calibri"/>
+                <w:b w:val="0"/>
+                <w:i w:val="0"/>
+                <w:color w:val="1A1A1A"/>
+                <w:sz w:val="21"/>
+              </w:rPr>
+            </w:r>
+          </w:p>
+        </w:tc>
+      </w:tr>
+      <w:tr>
+        <w:trPr>
+          <w:cantSplit/>
+          <w:trHeight w:val="595" w:hRule="atLeast"/>
+        </w:trPr>
+        <w:tc>
+          <w:tcPr>
+            <w:tcW w:type="dxa" w:w="1928"/>
+            <w:tcBorders>
+              <w:top w:val="single" w:sz="4" w:space="0" w:color="D5DEDE"/>
+              <w:left w:val="single" w:sz="4" w:space="0" w:color="D5DEDE"/>
+              <w:bottom w:val="single" w:sz="4" w:space="0" w:color="D5DEDE"/>
+              <w:right w:val="single" w:sz="4" w:space="0" w:color="D5DEDE"/>
+            </w:tcBorders>
+            <w:tcMar>
+              <w:top w:w="80" w:type="dxa"/>
+              <w:left w:w="80" w:type="dxa"/>
+              <w:bottom w:w="80" w:type="dxa"/>
+              <w:right w:w="80" w:type="dxa"/>
+            </w:tcMar>
+            <w:shd w:fill="F4F7F7" w:val="clear"/>
+          </w:tcPr>
+          <w:p>
+            <w:pPr>
+              <w:spacing w:before="0" w:after="0" w:line="259" w:lineRule="auto"/>
+              <w:jc w:val="left"/>
+            </w:pPr>
+            <w:r/>
+            <w:r>
+              <w:rPr>
+                <w:rFonts w:ascii="Calibri" w:hAnsi="Calibri" w:eastAsia="Calibri"/>
+                <w:b w:val="0"/>
+                <w:i w:val="0"/>
+                <w:color w:val="1A1A1A"/>
+                <w:sz w:val="21"/>
+              </w:rPr>
+              <w:t>Sognsvann stasjon</w:t>
+            </w:r>
+          </w:p>
+        </w:tc>
+        <w:tc>
+          <w:tcPr>
+            <w:tcW w:type="dxa" w:w="907"/>
+            <w:tcBorders>
+              <w:top w:val="single" w:sz="4" w:space="0" w:color="D5DEDE"/>
+              <w:left w:val="single" w:sz="4" w:space="0" w:color="D5DEDE"/>
+              <w:bottom w:val="single" w:sz="4" w:space="0" w:color="D5DEDE"/>
+              <w:right w:val="single" w:sz="4" w:space="0" w:color="D5DEDE"/>
+            </w:tcBorders>
+            <w:tcMar>
+              <w:top w:w="80" w:type="dxa"/>
+              <w:left w:w="80" w:type="dxa"/>
+              <w:bottom w:w="80" w:type="dxa"/>
+              <w:right w:w="80" w:type="dxa"/>
+            </w:tcMar>
+            <w:shd w:fill="F4F7F7" w:val="clear"/>
+          </w:tcPr>
+          <w:p>
+            <w:pPr>
+              <w:spacing w:before="0" w:after="0" w:line="259" w:lineRule="auto"/>
+              <w:jc w:val="left"/>
+            </w:pPr>
+            <w:r/>
+            <w:r>
+              <w:rPr>
+                <w:rFonts w:ascii="Calibri" w:hAnsi="Calibri" w:eastAsia="Calibri"/>
+                <w:b w:val="0"/>
+                <w:i w:val="0"/>
+                <w:color w:val="1A1A1A"/>
+                <w:sz w:val="21"/>
+              </w:rPr>
+            </w:r>
+          </w:p>
+        </w:tc>
+        <w:tc>
+          <w:tcPr>
+            <w:tcW w:type="dxa" w:w="1304"/>
+            <w:tcBorders>
+              <w:top w:val="single" w:sz="4" w:space="0" w:color="D5DEDE"/>
+              <w:left w:val="single" w:sz="4" w:space="0" w:color="D5DEDE"/>
+              <w:bottom w:val="single" w:sz="4" w:space="0" w:color="D5DEDE"/>
+              <w:right w:val="single" w:sz="4" w:space="0" w:color="D5DEDE"/>
+            </w:tcBorders>
+            <w:tcMar>
+              <w:top w:w="80" w:type="dxa"/>
+              <w:left w:w="80" w:type="dxa"/>
+              <w:bottom w:w="80" w:type="dxa"/>
+              <w:right w:w="80" w:type="dxa"/>
+            </w:tcMar>
+            <w:shd w:fill="F4F7F7" w:val="clear"/>
+          </w:tcPr>
+          <w:p>
+            <w:pPr>
+              <w:spacing w:before="0" w:after="0" w:line="259" w:lineRule="auto"/>
+              <w:jc w:val="left"/>
+            </w:pPr>
+            <w:r/>
+            <w:r>
+              <w:rPr>
+                <w:rFonts w:ascii="Calibri" w:hAnsi="Calibri" w:eastAsia="Calibri"/>
+                <w:b w:val="0"/>
+                <w:i w:val="0"/>
+                <w:color w:val="1A1A1A"/>
+                <w:sz w:val="21"/>
+              </w:rPr>
+            </w:r>
+          </w:p>
+        </w:tc>
+        <w:tc>
+          <w:tcPr>
+            <w:tcW w:type="dxa" w:w="1020"/>
+            <w:tcBorders>
+              <w:top w:val="single" w:sz="4" w:space="0" w:color="D5DEDE"/>
+              <w:left w:val="single" w:sz="4" w:space="0" w:color="D5DEDE"/>
+              <w:bottom w:val="single" w:sz="4" w:space="0" w:color="D5DEDE"/>
+              <w:right w:val="single" w:sz="4" w:space="0" w:color="D5DEDE"/>
+            </w:tcBorders>
+            <w:tcMar>
+              <w:top w:w="80" w:type="dxa"/>
+              <w:left w:w="80" w:type="dxa"/>
+              <w:bottom w:w="80" w:type="dxa"/>
+              <w:right w:w="80" w:type="dxa"/>
+            </w:tcMar>
+            <w:shd w:fill="F4F7F7" w:val="clear"/>
+          </w:tcPr>
+          <w:p>
+            <w:pPr>
+              <w:spacing w:before="0" w:after="0" w:line="259" w:lineRule="auto"/>
+              <w:jc w:val="left"/>
+            </w:pPr>
+            <w:r/>
+            <w:r>
+              <w:rPr>
+                <w:rFonts w:ascii="Calibri" w:hAnsi="Calibri" w:eastAsia="Calibri"/>
+                <w:b w:val="0"/>
+                <w:i w:val="0"/>
+                <w:color w:val="1A1A1A"/>
+                <w:sz w:val="21"/>
+              </w:rPr>
+            </w:r>
+          </w:p>
+        </w:tc>
+        <w:tc>
+          <w:tcPr>
+            <w:tcW w:type="dxa" w:w="1361"/>
+            <w:tcBorders>
+              <w:top w:val="single" w:sz="4" w:space="0" w:color="D5DEDE"/>
+              <w:left w:val="single" w:sz="4" w:space="0" w:color="D5DEDE"/>
+              <w:bottom w:val="single" w:sz="4" w:space="0" w:color="D5DEDE"/>
+              <w:right w:val="single" w:sz="4" w:space="0" w:color="D5DEDE"/>
+            </w:tcBorders>
+            <w:tcMar>
+              <w:top w:w="80" w:type="dxa"/>
+              <w:left w:w="80" w:type="dxa"/>
+              <w:bottom w:w="80" w:type="dxa"/>
+              <w:right w:w="80" w:type="dxa"/>
+            </w:tcMar>
+            <w:shd w:fill="F4F7F7" w:val="clear"/>
+          </w:tcPr>
+          <w:p>
+            <w:pPr>
+              <w:spacing w:before="0" w:after="0" w:line="259" w:lineRule="auto"/>
+              <w:jc w:val="left"/>
+            </w:pPr>
+            <w:r/>
+            <w:r>
+              <w:rPr>
+                <w:rFonts w:ascii="Calibri" w:hAnsi="Calibri" w:eastAsia="Calibri"/>
+                <w:b w:val="0"/>
+                <w:i w:val="0"/>
+                <w:color w:val="1A1A1A"/>
+                <w:sz w:val="21"/>
+              </w:rPr>
+            </w:r>
+          </w:p>
+        </w:tc>
+        <w:tc>
+          <w:tcPr>
+            <w:tcW w:type="dxa" w:w="1134"/>
+            <w:tcBorders>
+              <w:top w:val="single" w:sz="4" w:space="0" w:color="D5DEDE"/>
+              <w:left w:val="single" w:sz="4" w:space="0" w:color="D5DEDE"/>
+              <w:bottom w:val="single" w:sz="4" w:space="0" w:color="D5DEDE"/>
+              <w:right w:val="single" w:sz="4" w:space="0" w:color="D5DEDE"/>
+            </w:tcBorders>
+            <w:tcMar>
+              <w:top w:w="80" w:type="dxa"/>
+              <w:left w:w="80" w:type="dxa"/>
+              <w:bottom w:w="80" w:type="dxa"/>
+              <w:right w:w="80" w:type="dxa"/>
+            </w:tcMar>
+            <w:shd w:fill="F4F7F7" w:val="clear"/>
+          </w:tcPr>
+          <w:p>
+            <w:pPr>
+              <w:spacing w:before="0" w:after="0" w:line="259" w:lineRule="auto"/>
+              <w:jc w:val="left"/>
+            </w:pPr>
+            <w:r/>
+            <w:r>
+              <w:rPr>
+                <w:rFonts w:ascii="Calibri" w:hAnsi="Calibri" w:eastAsia="Calibri"/>
+                <w:b w:val="0"/>
+                <w:i w:val="0"/>
+                <w:color w:val="1A1A1A"/>
+                <w:sz w:val="21"/>
+              </w:rPr>
+              <w:t>198</w:t>
+            </w:r>
+          </w:p>
+        </w:tc>
+        <w:tc>
+          <w:tcPr>
+            <w:tcW w:type="dxa" w:w="1814"/>
+            <w:tcBorders>
+              <w:top w:val="single" w:sz="4" w:space="0" w:color="D5DEDE"/>
+              <w:left w:val="single" w:sz="4" w:space="0" w:color="D5DEDE"/>
+              <w:bottom w:val="single" w:sz="4" w:space="0" w:color="D5DEDE"/>
+              <w:right w:val="single" w:sz="4" w:space="0" w:color="D5DEDE"/>
+            </w:tcBorders>
+            <w:tcMar>
+              <w:top w:w="80" w:type="dxa"/>
+              <w:left w:w="80" w:type="dxa"/>
+              <w:bottom w:w="80" w:type="dxa"/>
+              <w:right w:w="80" w:type="dxa"/>
+            </w:tcMar>
+            <w:shd w:fill="F4F7F7" w:val="clear"/>
+          </w:tcPr>
+          <w:p>
+            <w:pPr>
+              <w:spacing w:before="0" w:after="0" w:line="259" w:lineRule="auto"/>
+              <w:jc w:val="left"/>
+            </w:pPr>
+            <w:r/>
+            <w:r>
+              <w:rPr>
+                <w:rFonts w:ascii="Calibri" w:hAnsi="Calibri" w:eastAsia="Calibri"/>
+                <w:b w:val="0"/>
+                <w:i w:val="0"/>
+                <w:color w:val="1A1A1A"/>
+                <w:sz w:val="21"/>
+              </w:rPr>
+            </w:r>
+          </w:p>
+        </w:tc>
+      </w:tr>
+      <w:tr>
+        <w:trPr>
+          <w:cantSplit/>
+          <w:trHeight w:val="595" w:hRule="atLeast"/>
+        </w:trPr>
+        <w:tc>
+          <w:tcPr>
+            <w:tcW w:type="dxa" w:w="1928"/>
+            <w:tcBorders>
+              <w:top w:val="single" w:sz="4" w:space="0" w:color="D5DEDE"/>
+              <w:left w:val="single" w:sz="4" w:space="0" w:color="D5DEDE"/>
+              <w:bottom w:val="single" w:sz="4" w:space="0" w:color="D5DEDE"/>
+              <w:right w:val="single" w:sz="4" w:space="0" w:color="D5DEDE"/>
+            </w:tcBorders>
+            <w:tcMar>
+              <w:top w:w="80" w:type="dxa"/>
+              <w:left w:w="80" w:type="dxa"/>
+              <w:bottom w:w="80" w:type="dxa"/>
+              <w:right w:w="80" w:type="dxa"/>
+            </w:tcMar>
+            <w:shd w:fill="FFFFFF" w:val="clear"/>
+          </w:tcPr>
+          <w:p>
+            <w:pPr>
+              <w:spacing w:before="0" w:after="0" w:line="259" w:lineRule="auto"/>
+              <w:jc w:val="left"/>
+            </w:pPr>
+            <w:r/>
+            <w:r>
+              <w:rPr>
+                <w:rFonts w:ascii="Calibri" w:hAnsi="Calibri" w:eastAsia="Calibri"/>
+                <w:b w:val="0"/>
+                <w:i w:val="0"/>
+                <w:color w:val="1A1A1A"/>
+                <w:sz w:val="21"/>
+              </w:rPr>
+              <w:t>Svartkulp</w:t>
+            </w:r>
+          </w:p>
+        </w:tc>
+        <w:tc>
+          <w:tcPr>
+            <w:tcW w:type="dxa" w:w="907"/>
+            <w:tcBorders>
+              <w:top w:val="single" w:sz="4" w:space="0" w:color="D5DEDE"/>
+              <w:left w:val="single" w:sz="4" w:space="0" w:color="D5DEDE"/>
+              <w:bottom w:val="single" w:sz="4" w:space="0" w:color="D5DEDE"/>
+              <w:right w:val="single" w:sz="4" w:space="0" w:color="D5DEDE"/>
+            </w:tcBorders>
+            <w:tcMar>
+              <w:top w:w="80" w:type="dxa"/>
+              <w:left w:w="80" w:type="dxa"/>
+              <w:bottom w:w="80" w:type="dxa"/>
+              <w:right w:w="80" w:type="dxa"/>
+            </w:tcMar>
+            <w:shd w:fill="FFFFFF" w:val="clear"/>
+          </w:tcPr>
+          <w:p>
+            <w:pPr>
+              <w:spacing w:before="0" w:after="0" w:line="259" w:lineRule="auto"/>
+              <w:jc w:val="left"/>
+            </w:pPr>
+            <w:r/>
+            <w:r>
+              <w:rPr>
+                <w:rFonts w:ascii="Calibri" w:hAnsi="Calibri" w:eastAsia="Calibri"/>
+                <w:b w:val="0"/>
+                <w:i w:val="0"/>
+                <w:color w:val="1A1A1A"/>
+                <w:sz w:val="21"/>
+              </w:rPr>
+            </w:r>
+          </w:p>
+        </w:tc>
+        <w:tc>
+          <w:tcPr>
+            <w:tcW w:type="dxa" w:w="1304"/>
+            <w:tcBorders>
+              <w:top w:val="single" w:sz="4" w:space="0" w:color="D5DEDE"/>
+              <w:left w:val="single" w:sz="4" w:space="0" w:color="D5DEDE"/>
+              <w:bottom w:val="single" w:sz="4" w:space="0" w:color="D5DEDE"/>
+              <w:right w:val="single" w:sz="4" w:space="0" w:color="D5DEDE"/>
+            </w:tcBorders>
+            <w:tcMar>
+              <w:top w:w="80" w:type="dxa"/>
+              <w:left w:w="80" w:type="dxa"/>
+              <w:bottom w:w="80" w:type="dxa"/>
+              <w:right w:w="80" w:type="dxa"/>
+            </w:tcMar>
+            <w:shd w:fill="FFFFFF" w:val="clear"/>
+          </w:tcPr>
+          <w:p>
+            <w:pPr>
+              <w:spacing w:before="0" w:after="0" w:line="259" w:lineRule="auto"/>
+              <w:jc w:val="left"/>
+            </w:pPr>
+            <w:r/>
+            <w:r>
+              <w:rPr>
+                <w:rFonts w:ascii="Calibri" w:hAnsi="Calibri" w:eastAsia="Calibri"/>
+                <w:b w:val="0"/>
+                <w:i w:val="0"/>
+                <w:color w:val="1A1A1A"/>
+                <w:sz w:val="21"/>
+              </w:rPr>
+            </w:r>
+          </w:p>
+        </w:tc>
+        <w:tc>
+          <w:tcPr>
+            <w:tcW w:type="dxa" w:w="1020"/>
+            <w:tcBorders>
+              <w:top w:val="single" w:sz="4" w:space="0" w:color="D5DEDE"/>
+              <w:left w:val="single" w:sz="4" w:space="0" w:color="D5DEDE"/>
+              <w:bottom w:val="single" w:sz="4" w:space="0" w:color="D5DEDE"/>
+              <w:right w:val="single" w:sz="4" w:space="0" w:color="D5DEDE"/>
+            </w:tcBorders>
+            <w:tcMar>
+              <w:top w:w="80" w:type="dxa"/>
+              <w:left w:w="80" w:type="dxa"/>
+              <w:bottom w:w="80" w:type="dxa"/>
+              <w:right w:w="80" w:type="dxa"/>
+            </w:tcMar>
+            <w:shd w:fill="FFFFFF" w:val="clear"/>
+          </w:tcPr>
+          <w:p>
+            <w:pPr>
+              <w:spacing w:before="0" w:after="0" w:line="259" w:lineRule="auto"/>
+              <w:jc w:val="left"/>
+            </w:pPr>
+            <w:r/>
+            <w:r>
+              <w:rPr>
+                <w:rFonts w:ascii="Calibri" w:hAnsi="Calibri" w:eastAsia="Calibri"/>
+                <w:b w:val="0"/>
+                <w:i w:val="0"/>
+                <w:color w:val="1A1A1A"/>
+                <w:sz w:val="21"/>
+              </w:rPr>
+            </w:r>
+          </w:p>
+        </w:tc>
+        <w:tc>
+          <w:tcPr>
+            <w:tcW w:type="dxa" w:w="1361"/>
+            <w:tcBorders>
+              <w:top w:val="single" w:sz="4" w:space="0" w:color="D5DEDE"/>
+              <w:left w:val="single" w:sz="4" w:space="0" w:color="D5DEDE"/>
+              <w:bottom w:val="single" w:sz="4" w:space="0" w:color="D5DEDE"/>
+              <w:right w:val="single" w:sz="4" w:space="0" w:color="D5DEDE"/>
+            </w:tcBorders>
+            <w:tcMar>
+              <w:top w:w="80" w:type="dxa"/>
+              <w:left w:w="80" w:type="dxa"/>
+              <w:bottom w:w="80" w:type="dxa"/>
+              <w:right w:w="80" w:type="dxa"/>
+            </w:tcMar>
+            <w:shd w:fill="FFFFFF" w:val="clear"/>
+          </w:tcPr>
+          <w:p>
+            <w:pPr>
+              <w:spacing w:before="0" w:after="0" w:line="259" w:lineRule="auto"/>
+              <w:jc w:val="left"/>
+            </w:pPr>
+            <w:r/>
+            <w:r>
+              <w:rPr>
+                <w:rFonts w:ascii="Calibri" w:hAnsi="Calibri" w:eastAsia="Calibri"/>
+                <w:b w:val="0"/>
+                <w:i w:val="0"/>
+                <w:color w:val="1A1A1A"/>
+                <w:sz w:val="21"/>
+              </w:rPr>
+            </w:r>
+          </w:p>
+        </w:tc>
+        <w:tc>
+          <w:tcPr>
+            <w:tcW w:type="dxa" w:w="1134"/>
+            <w:tcBorders>
+              <w:top w:val="single" w:sz="4" w:space="0" w:color="D5DEDE"/>
+              <w:left w:val="single" w:sz="4" w:space="0" w:color="D5DEDE"/>
+              <w:bottom w:val="single" w:sz="4" w:space="0" w:color="D5DEDE"/>
+              <w:right w:val="single" w:sz="4" w:space="0" w:color="D5DEDE"/>
+            </w:tcBorders>
+            <w:tcMar>
+              <w:top w:w="80" w:type="dxa"/>
+              <w:left w:w="80" w:type="dxa"/>
+              <w:bottom w:w="80" w:type="dxa"/>
+              <w:right w:w="80" w:type="dxa"/>
+            </w:tcMar>
+            <w:shd w:fill="FFFFFF" w:val="clear"/>
+          </w:tcPr>
+          <w:p>
+            <w:pPr>
+              <w:spacing w:before="0" w:after="0" w:line="259" w:lineRule="auto"/>
+              <w:jc w:val="left"/>
+            </w:pPr>
+            <w:r/>
+            <w:r>
+              <w:rPr>
+                <w:rFonts w:ascii="Calibri" w:hAnsi="Calibri" w:eastAsia="Calibri"/>
+                <w:b w:val="0"/>
+                <w:i w:val="0"/>
+                <w:color w:val="1A1A1A"/>
+                <w:sz w:val="21"/>
+              </w:rPr>
+            </w:r>
+          </w:p>
+        </w:tc>
+        <w:tc>
+          <w:tcPr>
+            <w:tcW w:type="dxa" w:w="1814"/>
+            <w:tcBorders>
+              <w:top w:val="single" w:sz="4" w:space="0" w:color="D5DEDE"/>
+              <w:left w:val="single" w:sz="4" w:space="0" w:color="D5DEDE"/>
+              <w:bottom w:val="single" w:sz="4" w:space="0" w:color="D5DEDE"/>
+              <w:right w:val="single" w:sz="4" w:space="0" w:color="D5DEDE"/>
+            </w:tcBorders>
+            <w:tcMar>
+              <w:top w:w="80" w:type="dxa"/>
+              <w:left w:w="80" w:type="dxa"/>
+              <w:bottom w:w="80" w:type="dxa"/>
+              <w:right w:w="80" w:type="dxa"/>
+            </w:tcMar>
+            <w:shd w:fill="FFFFFF" w:val="clear"/>
+          </w:tcPr>
+          <w:p>
+            <w:pPr>
+              <w:spacing w:before="0" w:after="0" w:line="259" w:lineRule="auto"/>
+              <w:jc w:val="left"/>
+            </w:pPr>
+            <w:r/>
+            <w:r>
+              <w:rPr>
+                <w:rFonts w:ascii="Calibri" w:hAnsi="Calibri" w:eastAsia="Calibri"/>
+                <w:b w:val="0"/>
+                <w:i w:val="0"/>
+                <w:color w:val="1A1A1A"/>
+                <w:sz w:val="21"/>
+              </w:rPr>
+            </w:r>
+          </w:p>
+        </w:tc>
+      </w:tr>
+      <w:tr>
+        <w:trPr>
+          <w:cantSplit/>
+          <w:trHeight w:val="595" w:hRule="atLeast"/>
+        </w:trPr>
+        <w:tc>
+          <w:tcPr>
+            <w:tcW w:type="dxa" w:w="1928"/>
+            <w:tcBorders>
+              <w:top w:val="single" w:sz="4" w:space="0" w:color="D5DEDE"/>
+              <w:left w:val="single" w:sz="4" w:space="0" w:color="D5DEDE"/>
+              <w:bottom w:val="single" w:sz="4" w:space="0" w:color="D5DEDE"/>
+              <w:right w:val="single" w:sz="4" w:space="0" w:color="D5DEDE"/>
+            </w:tcBorders>
+            <w:tcMar>
+              <w:top w:w="80" w:type="dxa"/>
+              <w:left w:w="80" w:type="dxa"/>
+              <w:bottom w:w="80" w:type="dxa"/>
+              <w:right w:w="80" w:type="dxa"/>
+            </w:tcMar>
+            <w:shd w:fill="F4F7F7" w:val="clear"/>
+          </w:tcPr>
+          <w:p>
+            <w:pPr>
+              <w:spacing w:before="0" w:after="0" w:line="259" w:lineRule="auto"/>
+              <w:jc w:val="left"/>
+            </w:pPr>
+            <w:r/>
+            <w:r>
+              <w:rPr>
+                <w:rFonts w:ascii="Calibri" w:hAnsi="Calibri" w:eastAsia="Calibri"/>
+                <w:b w:val="0"/>
+                <w:i w:val="0"/>
+                <w:color w:val="1A1A1A"/>
+                <w:sz w:val="21"/>
+              </w:rPr>
+              <w:t>Tåsen</w:t>
+            </w:r>
+          </w:p>
+        </w:tc>
+        <w:tc>
+          <w:tcPr>
+            <w:tcW w:type="dxa" w:w="907"/>
+            <w:tcBorders>
+              <w:top w:val="single" w:sz="4" w:space="0" w:color="D5DEDE"/>
+              <w:left w:val="single" w:sz="4" w:space="0" w:color="D5DEDE"/>
+              <w:bottom w:val="single" w:sz="4" w:space="0" w:color="D5DEDE"/>
+              <w:right w:val="single" w:sz="4" w:space="0" w:color="D5DEDE"/>
+            </w:tcBorders>
+            <w:tcMar>
+              <w:top w:w="80" w:type="dxa"/>
+              <w:left w:w="80" w:type="dxa"/>
+              <w:bottom w:w="80" w:type="dxa"/>
+              <w:right w:w="80" w:type="dxa"/>
+            </w:tcMar>
+            <w:shd w:fill="F4F7F7" w:val="clear"/>
+          </w:tcPr>
+          <w:p>
+            <w:pPr>
+              <w:spacing w:before="0" w:after="0" w:line="259" w:lineRule="auto"/>
+              <w:jc w:val="left"/>
+            </w:pPr>
+            <w:r/>
+            <w:r>
+              <w:rPr>
+                <w:rFonts w:ascii="Calibri" w:hAnsi="Calibri" w:eastAsia="Calibri"/>
+                <w:b w:val="0"/>
+                <w:i w:val="0"/>
+                <w:color w:val="1A1A1A"/>
+                <w:sz w:val="21"/>
+              </w:rPr>
+            </w:r>
+          </w:p>
+        </w:tc>
+        <w:tc>
+          <w:tcPr>
+            <w:tcW w:type="dxa" w:w="1304"/>
+            <w:tcBorders>
+              <w:top w:val="single" w:sz="4" w:space="0" w:color="D5DEDE"/>
+              <w:left w:val="single" w:sz="4" w:space="0" w:color="D5DEDE"/>
+              <w:bottom w:val="single" w:sz="4" w:space="0" w:color="D5DEDE"/>
+              <w:right w:val="single" w:sz="4" w:space="0" w:color="D5DEDE"/>
+            </w:tcBorders>
+            <w:tcMar>
+              <w:top w:w="80" w:type="dxa"/>
+              <w:left w:w="80" w:type="dxa"/>
+              <w:bottom w:w="80" w:type="dxa"/>
+              <w:right w:w="80" w:type="dxa"/>
+            </w:tcMar>
+            <w:shd w:fill="F4F7F7" w:val="clear"/>
+          </w:tcPr>
+          <w:p>
+            <w:pPr>
+              <w:spacing w:before="0" w:after="0" w:line="259" w:lineRule="auto"/>
+              <w:jc w:val="left"/>
+            </w:pPr>
+            <w:r/>
+            <w:r>
+              <w:rPr>
+                <w:rFonts w:ascii="Calibri" w:hAnsi="Calibri" w:eastAsia="Calibri"/>
+                <w:b w:val="0"/>
+                <w:i w:val="0"/>
+                <w:color w:val="1A1A1A"/>
+                <w:sz w:val="21"/>
+              </w:rPr>
+            </w:r>
+          </w:p>
+        </w:tc>
+        <w:tc>
+          <w:tcPr>
+            <w:tcW w:type="dxa" w:w="1020"/>
+            <w:tcBorders>
+              <w:top w:val="single" w:sz="4" w:space="0" w:color="D5DEDE"/>
+              <w:left w:val="single" w:sz="4" w:space="0" w:color="D5DEDE"/>
+              <w:bottom w:val="single" w:sz="4" w:space="0" w:color="D5DEDE"/>
+              <w:right w:val="single" w:sz="4" w:space="0" w:color="D5DEDE"/>
+            </w:tcBorders>
+            <w:tcMar>
+              <w:top w:w="80" w:type="dxa"/>
+              <w:left w:w="80" w:type="dxa"/>
+              <w:bottom w:w="80" w:type="dxa"/>
+              <w:right w:w="80" w:type="dxa"/>
+            </w:tcMar>
+            <w:shd w:fill="F4F7F7" w:val="clear"/>
+          </w:tcPr>
+          <w:p>
+            <w:pPr>
+              <w:spacing w:before="0" w:after="0" w:line="259" w:lineRule="auto"/>
+              <w:jc w:val="left"/>
+            </w:pPr>
+            <w:r/>
+            <w:r>
+              <w:rPr>
+                <w:rFonts w:ascii="Calibri" w:hAnsi="Calibri" w:eastAsia="Calibri"/>
+                <w:b w:val="0"/>
+                <w:i w:val="0"/>
+                <w:color w:val="1A1A1A"/>
+                <w:sz w:val="21"/>
+              </w:rPr>
+            </w:r>
+          </w:p>
+        </w:tc>
+        <w:tc>
+          <w:tcPr>
+            <w:tcW w:type="dxa" w:w="1361"/>
+            <w:tcBorders>
+              <w:top w:val="single" w:sz="4" w:space="0" w:color="D5DEDE"/>
+              <w:left w:val="single" w:sz="4" w:space="0" w:color="D5DEDE"/>
+              <w:bottom w:val="single" w:sz="4" w:space="0" w:color="D5DEDE"/>
+              <w:right w:val="single" w:sz="4" w:space="0" w:color="D5DEDE"/>
+            </w:tcBorders>
+            <w:tcMar>
+              <w:top w:w="80" w:type="dxa"/>
+              <w:left w:w="80" w:type="dxa"/>
+              <w:bottom w:w="80" w:type="dxa"/>
+              <w:right w:w="80" w:type="dxa"/>
+            </w:tcMar>
+            <w:shd w:fill="F4F7F7" w:val="clear"/>
+          </w:tcPr>
+          <w:p>
+            <w:pPr>
+              <w:spacing w:before="0" w:after="0" w:line="259" w:lineRule="auto"/>
+              <w:jc w:val="left"/>
+            </w:pPr>
+            <w:r/>
+            <w:r>
+              <w:rPr>
+                <w:rFonts w:ascii="Calibri" w:hAnsi="Calibri" w:eastAsia="Calibri"/>
+                <w:b w:val="0"/>
+                <w:i w:val="0"/>
+                <w:color w:val="1A1A1A"/>
+                <w:sz w:val="21"/>
+              </w:rPr>
+            </w:r>
+          </w:p>
+        </w:tc>
+        <w:tc>
+          <w:tcPr>
+            <w:tcW w:type="dxa" w:w="1134"/>
+            <w:tcBorders>
+              <w:top w:val="single" w:sz="4" w:space="0" w:color="D5DEDE"/>
+              <w:left w:val="single" w:sz="4" w:space="0" w:color="D5DEDE"/>
+              <w:bottom w:val="single" w:sz="4" w:space="0" w:color="D5DEDE"/>
+              <w:right w:val="single" w:sz="4" w:space="0" w:color="D5DEDE"/>
+            </w:tcBorders>
+            <w:tcMar>
+              <w:top w:w="80" w:type="dxa"/>
+              <w:left w:w="80" w:type="dxa"/>
+              <w:bottom w:w="80" w:type="dxa"/>
+              <w:right w:w="80" w:type="dxa"/>
+            </w:tcMar>
+            <w:shd w:fill="F4F7F7" w:val="clear"/>
+          </w:tcPr>
+          <w:p>
+            <w:pPr>
+              <w:spacing w:before="0" w:after="0" w:line="259" w:lineRule="auto"/>
+              <w:jc w:val="left"/>
+            </w:pPr>
+            <w:r/>
+            <w:r>
+              <w:rPr>
+                <w:rFonts w:ascii="Calibri" w:hAnsi="Calibri" w:eastAsia="Calibri"/>
+                <w:b w:val="0"/>
+                <w:i w:val="0"/>
+                <w:color w:val="1A1A1A"/>
+                <w:sz w:val="21"/>
+              </w:rPr>
+              <w:t>123</w:t>
+            </w:r>
+          </w:p>
+        </w:tc>
+        <w:tc>
+          <w:tcPr>
+            <w:tcW w:type="dxa" w:w="1814"/>
+            <w:tcBorders>
+              <w:top w:val="single" w:sz="4" w:space="0" w:color="D5DEDE"/>
+              <w:left w:val="single" w:sz="4" w:space="0" w:color="D5DEDE"/>
+              <w:bottom w:val="single" w:sz="4" w:space="0" w:color="D5DEDE"/>
+              <w:right w:val="single" w:sz="4" w:space="0" w:color="D5DEDE"/>
+            </w:tcBorders>
+            <w:tcMar>
+              <w:top w:w="80" w:type="dxa"/>
+              <w:left w:w="80" w:type="dxa"/>
+              <w:bottom w:w="80" w:type="dxa"/>
+              <w:right w:w="80" w:type="dxa"/>
+            </w:tcMar>
+            <w:shd w:fill="F4F7F7" w:val="clear"/>
+          </w:tcPr>
+          <w:p>
+            <w:pPr>
+              <w:spacing w:before="0" w:after="0" w:line="259" w:lineRule="auto"/>
+              <w:jc w:val="left"/>
+            </w:pPr>
+            <w:r/>
+            <w:r>
+              <w:rPr>
+                <w:rFonts w:ascii="Calibri" w:hAnsi="Calibri" w:eastAsia="Calibri"/>
+                <w:b w:val="0"/>
+                <w:i w:val="0"/>
+                <w:color w:val="1A1A1A"/>
+                <w:sz w:val="21"/>
+              </w:rPr>
+            </w:r>
+          </w:p>
+        </w:tc>
+      </w:tr>
+      <w:tr>
+        <w:trPr>
+          <w:cantSplit/>
+          <w:trHeight w:val="595" w:hRule="atLeast"/>
+        </w:trPr>
+        <w:tc>
+          <w:tcPr>
+            <w:tcW w:type="dxa" w:w="1928"/>
+            <w:tcBorders>
+              <w:top w:val="single" w:sz="4" w:space="0" w:color="D5DEDE"/>
+              <w:left w:val="single" w:sz="4" w:space="0" w:color="D5DEDE"/>
+              <w:bottom w:val="single" w:sz="4" w:space="0" w:color="D5DEDE"/>
+              <w:right w:val="single" w:sz="4" w:space="0" w:color="D5DEDE"/>
+            </w:tcBorders>
+            <w:tcMar>
+              <w:top w:w="80" w:type="dxa"/>
+              <w:left w:w="80" w:type="dxa"/>
+              <w:bottom w:w="80" w:type="dxa"/>
+              <w:right w:w="80" w:type="dxa"/>
+            </w:tcMar>
+            <w:shd w:fill="FFFFFF" w:val="clear"/>
+          </w:tcPr>
+          <w:p>
+            <w:pPr>
+              <w:spacing w:before="0" w:after="0" w:line="259" w:lineRule="auto"/>
+              <w:jc w:val="left"/>
+            </w:pPr>
+            <w:r/>
+            <w:r>
+              <w:rPr>
+                <w:rFonts w:ascii="Calibri" w:hAnsi="Calibri" w:eastAsia="Calibri"/>
+                <w:b w:val="0"/>
+                <w:i w:val="0"/>
+                <w:color w:val="1A1A1A"/>
+                <w:sz w:val="21"/>
+              </w:rPr>
+              <w:t>Ullevål stadion</w:t>
+            </w:r>
+          </w:p>
+        </w:tc>
+        <w:tc>
+          <w:tcPr>
+            <w:tcW w:type="dxa" w:w="907"/>
+            <w:tcBorders>
+              <w:top w:val="single" w:sz="4" w:space="0" w:color="D5DEDE"/>
+              <w:left w:val="single" w:sz="4" w:space="0" w:color="D5DEDE"/>
+              <w:bottom w:val="single" w:sz="4" w:space="0" w:color="D5DEDE"/>
+              <w:right w:val="single" w:sz="4" w:space="0" w:color="D5DEDE"/>
+            </w:tcBorders>
+            <w:tcMar>
+              <w:top w:w="80" w:type="dxa"/>
+              <w:left w:w="80" w:type="dxa"/>
+              <w:bottom w:w="80" w:type="dxa"/>
+              <w:right w:w="80" w:type="dxa"/>
+            </w:tcMar>
+            <w:shd w:fill="FFFFFF" w:val="clear"/>
+          </w:tcPr>
+          <w:p>
+            <w:pPr>
+              <w:spacing w:before="0" w:after="0" w:line="259" w:lineRule="auto"/>
+              <w:jc w:val="left"/>
+            </w:pPr>
+            <w:r/>
+            <w:r>
+              <w:rPr>
+                <w:rFonts w:ascii="Calibri" w:hAnsi="Calibri" w:eastAsia="Calibri"/>
+                <w:b w:val="0"/>
+                <w:i w:val="0"/>
+                <w:color w:val="1A1A1A"/>
+                <w:sz w:val="21"/>
+              </w:rPr>
+            </w:r>
+          </w:p>
+        </w:tc>
+        <w:tc>
+          <w:tcPr>
+            <w:tcW w:type="dxa" w:w="1304"/>
+            <w:tcBorders>
+              <w:top w:val="single" w:sz="4" w:space="0" w:color="D5DEDE"/>
+              <w:left w:val="single" w:sz="4" w:space="0" w:color="D5DEDE"/>
+              <w:bottom w:val="single" w:sz="4" w:space="0" w:color="D5DEDE"/>
+              <w:right w:val="single" w:sz="4" w:space="0" w:color="D5DEDE"/>
+            </w:tcBorders>
+            <w:tcMar>
+              <w:top w:w="80" w:type="dxa"/>
+              <w:left w:w="80" w:type="dxa"/>
+              <w:bottom w:w="80" w:type="dxa"/>
+              <w:right w:w="80" w:type="dxa"/>
+            </w:tcMar>
+            <w:shd w:fill="FFFFFF" w:val="clear"/>
+          </w:tcPr>
+          <w:p>
+            <w:pPr>
+              <w:spacing w:before="0" w:after="0" w:line="259" w:lineRule="auto"/>
+              <w:jc w:val="left"/>
+            </w:pPr>
+            <w:r/>
+            <w:r>
+              <w:rPr>
+                <w:rFonts w:ascii="Calibri" w:hAnsi="Calibri" w:eastAsia="Calibri"/>
+                <w:b w:val="0"/>
+                <w:i w:val="0"/>
+                <w:color w:val="1A1A1A"/>
+                <w:sz w:val="21"/>
+              </w:rPr>
+            </w:r>
+          </w:p>
+        </w:tc>
+        <w:tc>
+          <w:tcPr>
+            <w:tcW w:type="dxa" w:w="1020"/>
+            <w:tcBorders>
+              <w:top w:val="single" w:sz="4" w:space="0" w:color="D5DEDE"/>
+              <w:left w:val="single" w:sz="4" w:space="0" w:color="D5DEDE"/>
+              <w:bottom w:val="single" w:sz="4" w:space="0" w:color="D5DEDE"/>
+              <w:right w:val="single" w:sz="4" w:space="0" w:color="D5DEDE"/>
+            </w:tcBorders>
+            <w:tcMar>
+              <w:top w:w="80" w:type="dxa"/>
+              <w:left w:w="80" w:type="dxa"/>
+              <w:bottom w:w="80" w:type="dxa"/>
+              <w:right w:w="80" w:type="dxa"/>
+            </w:tcMar>
+            <w:shd w:fill="FFFFFF" w:val="clear"/>
+          </w:tcPr>
+          <w:p>
+            <w:pPr>
+              <w:spacing w:before="0" w:after="0" w:line="259" w:lineRule="auto"/>
+              <w:jc w:val="left"/>
+            </w:pPr>
+            <w:r/>
+            <w:r>
+              <w:rPr>
+                <w:rFonts w:ascii="Calibri" w:hAnsi="Calibri" w:eastAsia="Calibri"/>
+                <w:b w:val="0"/>
+                <w:i w:val="0"/>
+                <w:color w:val="1A1A1A"/>
+                <w:sz w:val="21"/>
+              </w:rPr>
+            </w:r>
+          </w:p>
+        </w:tc>
+        <w:tc>
+          <w:tcPr>
+            <w:tcW w:type="dxa" w:w="1361"/>
+            <w:tcBorders>
+              <w:top w:val="single" w:sz="4" w:space="0" w:color="D5DEDE"/>
+              <w:left w:val="single" w:sz="4" w:space="0" w:color="D5DEDE"/>
+              <w:bottom w:val="single" w:sz="4" w:space="0" w:color="D5DEDE"/>
+              <w:right w:val="single" w:sz="4" w:space="0" w:color="D5DEDE"/>
+            </w:tcBorders>
+            <w:tcMar>
+              <w:top w:w="80" w:type="dxa"/>
+              <w:left w:w="80" w:type="dxa"/>
+              <w:bottom w:w="80" w:type="dxa"/>
+              <w:right w:w="80" w:type="dxa"/>
+            </w:tcMar>
+            <w:shd w:fill="FFFFFF" w:val="clear"/>
+          </w:tcPr>
+          <w:p>
+            <w:pPr>
+              <w:spacing w:before="0" w:after="0" w:line="259" w:lineRule="auto"/>
+              <w:jc w:val="left"/>
+            </w:pPr>
+            <w:r/>
+            <w:r>
+              <w:rPr>
+                <w:rFonts w:ascii="Calibri" w:hAnsi="Calibri" w:eastAsia="Calibri"/>
+                <w:b w:val="0"/>
+                <w:i w:val="0"/>
+                <w:color w:val="1A1A1A"/>
+                <w:sz w:val="21"/>
+              </w:rPr>
+            </w:r>
+          </w:p>
+        </w:tc>
+        <w:tc>
+          <w:tcPr>
+            <w:tcW w:type="dxa" w:w="1134"/>
+            <w:tcBorders>
+              <w:top w:val="single" w:sz="4" w:space="0" w:color="D5DEDE"/>
+              <w:left w:val="single" w:sz="4" w:space="0" w:color="D5DEDE"/>
+              <w:bottom w:val="single" w:sz="4" w:space="0" w:color="D5DEDE"/>
+              <w:right w:val="single" w:sz="4" w:space="0" w:color="D5DEDE"/>
+            </w:tcBorders>
+            <w:tcMar>
+              <w:top w:w="80" w:type="dxa"/>
+              <w:left w:w="80" w:type="dxa"/>
+              <w:bottom w:w="80" w:type="dxa"/>
+              <w:right w:w="80" w:type="dxa"/>
+            </w:tcMar>
+            <w:shd w:fill="FFFFFF" w:val="clear"/>
+          </w:tcPr>
+          <w:p>
+            <w:pPr>
+              <w:spacing w:before="0" w:after="0" w:line="259" w:lineRule="auto"/>
+              <w:jc w:val="left"/>
+            </w:pPr>
+            <w:r/>
+            <w:r>
+              <w:rPr>
+                <w:rFonts w:ascii="Calibri" w:hAnsi="Calibri" w:eastAsia="Calibri"/>
+                <w:b w:val="0"/>
+                <w:i w:val="0"/>
+                <w:color w:val="1A1A1A"/>
+                <w:sz w:val="21"/>
+              </w:rPr>
+              <w:t>98</w:t>
+            </w:r>
+          </w:p>
+        </w:tc>
+        <w:tc>
+          <w:tcPr>
+            <w:tcW w:type="dxa" w:w="1814"/>
+            <w:tcBorders>
+              <w:top w:val="single" w:sz="4" w:space="0" w:color="D5DEDE"/>
+              <w:left w:val="single" w:sz="4" w:space="0" w:color="D5DEDE"/>
+              <w:bottom w:val="single" w:sz="4" w:space="0" w:color="D5DEDE"/>
+              <w:right w:val="single" w:sz="4" w:space="0" w:color="D5DEDE"/>
+            </w:tcBorders>
+            <w:tcMar>
+              <w:top w:w="80" w:type="dxa"/>
+              <w:left w:w="80" w:type="dxa"/>
+              <w:bottom w:w="80" w:type="dxa"/>
+              <w:right w:w="80" w:type="dxa"/>
+            </w:tcMar>
+            <w:shd w:fill="FFFFFF" w:val="clear"/>
+          </w:tcPr>
+          <w:p>
+            <w:pPr>
+              <w:spacing w:before="0" w:after="0" w:line="259" w:lineRule="auto"/>
+              <w:jc w:val="left"/>
+            </w:pPr>
+            <w:r/>
+            <w:r>
+              <w:rPr>
+                <w:rFonts w:ascii="Calibri" w:hAnsi="Calibri" w:eastAsia="Calibri"/>
+                <w:b w:val="0"/>
+                <w:i w:val="0"/>
+                <w:color w:val="1A1A1A"/>
+                <w:sz w:val="21"/>
+              </w:rPr>
+            </w:r>
+          </w:p>
+        </w:tc>
+      </w:tr>
+      <w:tr>
+        <w:trPr>
+          <w:cantSplit/>
+          <w:trHeight w:val="595" w:hRule="atLeast"/>
+        </w:trPr>
+        <w:tc>
+          <w:tcPr>
+            <w:tcW w:type="dxa" w:w="1928"/>
+            <w:tcBorders>
+              <w:top w:val="single" w:sz="4" w:space="0" w:color="D5DEDE"/>
+              <w:left w:val="single" w:sz="4" w:space="0" w:color="D5DEDE"/>
+              <w:bottom w:val="single" w:sz="4" w:space="0" w:color="D5DEDE"/>
+              <w:right w:val="single" w:sz="4" w:space="0" w:color="D5DEDE"/>
+            </w:tcBorders>
+            <w:tcMar>
+              <w:top w:w="80" w:type="dxa"/>
+              <w:left w:w="80" w:type="dxa"/>
+              <w:bottom w:w="80" w:type="dxa"/>
+              <w:right w:w="80" w:type="dxa"/>
+            </w:tcMar>
+            <w:shd w:fill="F4F7F7" w:val="clear"/>
+          </w:tcPr>
+          <w:p>
+            <w:pPr>
+              <w:spacing w:before="0" w:after="0" w:line="259" w:lineRule="auto"/>
+              <w:jc w:val="left"/>
+            </w:pPr>
+            <w:r/>
+            <w:r>
+              <w:rPr>
+                <w:rFonts w:ascii="Calibri" w:hAnsi="Calibri" w:eastAsia="Calibri"/>
+                <w:b w:val="0"/>
+                <w:i w:val="0"/>
+                <w:color w:val="1A1A1A"/>
+                <w:sz w:val="21"/>
+              </w:rPr>
+              <w:t>Blindern</w:t>
+            </w:r>
+          </w:p>
+        </w:tc>
+        <w:tc>
+          <w:tcPr>
+            <w:tcW w:type="dxa" w:w="907"/>
+            <w:tcBorders>
+              <w:top w:val="single" w:sz="4" w:space="0" w:color="D5DEDE"/>
+              <w:left w:val="single" w:sz="4" w:space="0" w:color="D5DEDE"/>
+              <w:bottom w:val="single" w:sz="4" w:space="0" w:color="D5DEDE"/>
+              <w:right w:val="single" w:sz="4" w:space="0" w:color="D5DEDE"/>
+            </w:tcBorders>
+            <w:tcMar>
+              <w:top w:w="80" w:type="dxa"/>
+              <w:left w:w="80" w:type="dxa"/>
+              <w:bottom w:w="80" w:type="dxa"/>
+              <w:right w:w="80" w:type="dxa"/>
+            </w:tcMar>
+            <w:shd w:fill="F4F7F7" w:val="clear"/>
+          </w:tcPr>
+          <w:p>
+            <w:pPr>
+              <w:spacing w:before="0" w:after="0" w:line="259" w:lineRule="auto"/>
+              <w:jc w:val="left"/>
+            </w:pPr>
+            <w:r/>
+            <w:r>
+              <w:rPr>
+                <w:rFonts w:ascii="Calibri" w:hAnsi="Calibri" w:eastAsia="Calibri"/>
+                <w:b w:val="0"/>
+                <w:i w:val="0"/>
+                <w:color w:val="1A1A1A"/>
+                <w:sz w:val="21"/>
+              </w:rPr>
+            </w:r>
+          </w:p>
+        </w:tc>
+        <w:tc>
+          <w:tcPr>
+            <w:tcW w:type="dxa" w:w="1304"/>
+            <w:tcBorders>
+              <w:top w:val="single" w:sz="4" w:space="0" w:color="D5DEDE"/>
+              <w:left w:val="single" w:sz="4" w:space="0" w:color="D5DEDE"/>
+              <w:bottom w:val="single" w:sz="4" w:space="0" w:color="D5DEDE"/>
+              <w:right w:val="single" w:sz="4" w:space="0" w:color="D5DEDE"/>
+            </w:tcBorders>
+            <w:tcMar>
+              <w:top w:w="80" w:type="dxa"/>
+              <w:left w:w="80" w:type="dxa"/>
+              <w:bottom w:w="80" w:type="dxa"/>
+              <w:right w:w="80" w:type="dxa"/>
+            </w:tcMar>
+            <w:shd w:fill="F4F7F7" w:val="clear"/>
+          </w:tcPr>
+          <w:p>
+            <w:pPr>
+              <w:spacing w:before="0" w:after="0" w:line="259" w:lineRule="auto"/>
+              <w:jc w:val="left"/>
+            </w:pPr>
+            <w:r/>
+            <w:r>
+              <w:rPr>
+                <w:rFonts w:ascii="Calibri" w:hAnsi="Calibri" w:eastAsia="Calibri"/>
+                <w:b w:val="0"/>
+                <w:i w:val="0"/>
+                <w:color w:val="1A1A1A"/>
+                <w:sz w:val="21"/>
+              </w:rPr>
+            </w:r>
+          </w:p>
+        </w:tc>
+        <w:tc>
+          <w:tcPr>
+            <w:tcW w:type="dxa" w:w="1020"/>
+            <w:tcBorders>
+              <w:top w:val="single" w:sz="4" w:space="0" w:color="D5DEDE"/>
+              <w:left w:val="single" w:sz="4" w:space="0" w:color="D5DEDE"/>
+              <w:bottom w:val="single" w:sz="4" w:space="0" w:color="D5DEDE"/>
+              <w:right w:val="single" w:sz="4" w:space="0" w:color="D5DEDE"/>
+            </w:tcBorders>
+            <w:tcMar>
+              <w:top w:w="80" w:type="dxa"/>
+              <w:left w:w="80" w:type="dxa"/>
+              <w:bottom w:w="80" w:type="dxa"/>
+              <w:right w:w="80" w:type="dxa"/>
+            </w:tcMar>
+            <w:shd w:fill="F4F7F7" w:val="clear"/>
+          </w:tcPr>
+          <w:p>
+            <w:pPr>
+              <w:spacing w:before="0" w:after="0" w:line="259" w:lineRule="auto"/>
+              <w:jc w:val="left"/>
+            </w:pPr>
+            <w:r/>
+            <w:r>
+              <w:rPr>
+                <w:rFonts w:ascii="Calibri" w:hAnsi="Calibri" w:eastAsia="Calibri"/>
+                <w:b w:val="0"/>
+                <w:i w:val="0"/>
+                <w:color w:val="1A1A1A"/>
+                <w:sz w:val="21"/>
+              </w:rPr>
+            </w:r>
+          </w:p>
+        </w:tc>
+        <w:tc>
+          <w:tcPr>
+            <w:tcW w:type="dxa" w:w="1361"/>
+            <w:tcBorders>
+              <w:top w:val="single" w:sz="4" w:space="0" w:color="D5DEDE"/>
+              <w:left w:val="single" w:sz="4" w:space="0" w:color="D5DEDE"/>
+              <w:bottom w:val="single" w:sz="4" w:space="0" w:color="D5DEDE"/>
+              <w:right w:val="single" w:sz="4" w:space="0" w:color="D5DEDE"/>
+            </w:tcBorders>
+            <w:tcMar>
+              <w:top w:w="80" w:type="dxa"/>
+              <w:left w:w="80" w:type="dxa"/>
+              <w:bottom w:w="80" w:type="dxa"/>
+              <w:right w:w="80" w:type="dxa"/>
+            </w:tcMar>
+            <w:shd w:fill="F4F7F7" w:val="clear"/>
+          </w:tcPr>
+          <w:p>
+            <w:pPr>
+              <w:spacing w:before="0" w:after="0" w:line="259" w:lineRule="auto"/>
+              <w:jc w:val="left"/>
+            </w:pPr>
+            <w:r/>
+            <w:r>
+              <w:rPr>
+                <w:rFonts w:ascii="Calibri" w:hAnsi="Calibri" w:eastAsia="Calibri"/>
+                <w:b w:val="0"/>
+                <w:i w:val="0"/>
+                <w:color w:val="1A1A1A"/>
+                <w:sz w:val="21"/>
+              </w:rPr>
+            </w:r>
+          </w:p>
+        </w:tc>
+        <w:tc>
+          <w:tcPr>
+            <w:tcW w:type="dxa" w:w="1134"/>
+            <w:tcBorders>
+              <w:top w:val="single" w:sz="4" w:space="0" w:color="D5DEDE"/>
+              <w:left w:val="single" w:sz="4" w:space="0" w:color="D5DEDE"/>
+              <w:bottom w:val="single" w:sz="4" w:space="0" w:color="D5DEDE"/>
+              <w:right w:val="single" w:sz="4" w:space="0" w:color="D5DEDE"/>
+            </w:tcBorders>
+            <w:tcMar>
+              <w:top w:w="80" w:type="dxa"/>
+              <w:left w:w="80" w:type="dxa"/>
+              <w:bottom w:w="80" w:type="dxa"/>
+              <w:right w:w="80" w:type="dxa"/>
+            </w:tcMar>
+            <w:shd w:fill="F4F7F7" w:val="clear"/>
+          </w:tcPr>
+          <w:p>
+            <w:pPr>
+              <w:spacing w:before="0" w:after="0" w:line="259" w:lineRule="auto"/>
+              <w:jc w:val="left"/>
+            </w:pPr>
+            <w:r/>
+            <w:r>
+              <w:rPr>
+                <w:rFonts w:ascii="Calibri" w:hAnsi="Calibri" w:eastAsia="Calibri"/>
+                <w:b w:val="0"/>
+                <w:i w:val="0"/>
+                <w:color w:val="1A1A1A"/>
+                <w:sz w:val="21"/>
+              </w:rPr>
+              <w:t>75</w:t>
+            </w:r>
+          </w:p>
+        </w:tc>
+        <w:tc>
+          <w:tcPr>
+            <w:tcW w:type="dxa" w:w="1814"/>
+            <w:tcBorders>
+              <w:top w:val="single" w:sz="4" w:space="0" w:color="D5DEDE"/>
+              <w:left w:val="single" w:sz="4" w:space="0" w:color="D5DEDE"/>
+              <w:bottom w:val="single" w:sz="4" w:space="0" w:color="D5DEDE"/>
+              <w:right w:val="single" w:sz="4" w:space="0" w:color="D5DEDE"/>
+            </w:tcBorders>
+            <w:tcMar>
+              <w:top w:w="80" w:type="dxa"/>
+              <w:left w:w="80" w:type="dxa"/>
+              <w:bottom w:w="80" w:type="dxa"/>
+              <w:right w:w="80" w:type="dxa"/>
+            </w:tcMar>
+            <w:shd w:fill="F4F7F7" w:val="clear"/>
+          </w:tcPr>
+          <w:p>
+            <w:pPr>
+              <w:spacing w:before="0" w:after="0" w:line="259" w:lineRule="auto"/>
+              <w:jc w:val="left"/>
+            </w:pPr>
+            <w:r/>
+            <w:r>
+              <w:rPr>
+                <w:rFonts w:ascii="Calibri" w:hAnsi="Calibri" w:eastAsia="Calibri"/>
+                <w:b w:val="0"/>
+                <w:i w:val="0"/>
+                <w:color w:val="1A1A1A"/>
+                <w:sz w:val="21"/>
+              </w:rPr>
+            </w:r>
+          </w:p>
+        </w:tc>
+      </w:tr>
+    </w:tbl>
+    <w:p/>
+    <w:tbl>
+      <w:tblPr>
+        <w:tblW w:type="auto" w:w="0"/>
+        <w:jc w:val="center"/>
+        <w:tblLayout w:type="fixed"/>
+        <w:tblLook w:firstColumn="1" w:firstRow="1" w:lastColumn="0" w:lastRow="0" w:noHBand="0" w:noVBand="1" w:val="04A0"/>
+        <w:tblW w:w="9468" w:type="dxa"/>
+        <w:tblLayout w:type="fixed"/>
+      </w:tblPr>
+      <w:tblGrid>
+        <w:gridCol w:w="4819"/>
+        <w:gridCol w:w="4819"/>
+      </w:tblGrid>
+      <w:tr>
+        <w:trPr>
+          <w:cantSplit/>
+        </w:trPr>
+        <w:tc>
+          <w:tcPr>
+            <w:tcW w:type="dxa" w:w="4535"/>
+            <w:tcBorders>
+              <w:top w:val="single" w:sz="4" w:space="0" w:color="D5DEDE"/>
+              <w:left w:val="single" w:sz="4" w:space="0" w:color="D5DEDE"/>
+              <w:bottom w:val="single" w:sz="4" w:space="0" w:color="D5DEDE"/>
+              <w:right w:val="single" w:sz="4" w:space="0" w:color="D5DEDE"/>
+            </w:tcBorders>
+            <w:tcMar>
+              <w:top w:w="80" w:type="dxa"/>
+              <w:left w:w="80" w:type="dxa"/>
+              <w:bottom w:w="80" w:type="dxa"/>
+              <w:right w:w="80" w:type="dxa"/>
+            </w:tcMar>
+            <w:shd w:fill="1B3A4B" w:val="clear"/>
+          </w:tcPr>
+          <w:p>
+            <w:pPr>
+              <w:spacing w:before="0" w:after="0" w:line="259" w:lineRule="auto"/>
+              <w:jc w:val="left"/>
+            </w:pPr>
+            <w:r/>
+            <w:r>
+              <w:rPr>
+                <w:rFonts w:ascii="Calibri" w:hAnsi="Calibri" w:eastAsia="Calibri"/>
+                <w:b/>
+                <w:i w:val="0"/>
+                <w:color w:val="FFFFFF"/>
+                <w:sz w:val="21"/>
+              </w:rPr>
+            </w:r>
+          </w:p>
+        </w:tc>
+        <w:tc>
+          <w:tcPr>
+            <w:tcW w:type="dxa" w:w="4932"/>
+            <w:tcBorders>
+              <w:top w:val="single" w:sz="4" w:space="0" w:color="D5DEDE"/>
+              <w:left w:val="single" w:sz="4" w:space="0" w:color="D5DEDE"/>
+              <w:bottom w:val="single" w:sz="4" w:space="0" w:color="D5DEDE"/>
+              <w:right w:val="single" w:sz="4" w:space="0" w:color="D5DEDE"/>
+            </w:tcBorders>
+            <w:tcMar>
+              <w:top w:w="80" w:type="dxa"/>
+              <w:left w:w="80" w:type="dxa"/>
+              <w:bottom w:w="80" w:type="dxa"/>
+              <w:right w:w="80" w:type="dxa"/>
+            </w:tcMar>
+            <w:shd w:fill="1B3A4B" w:val="clear"/>
+          </w:tcPr>
+          <w:p>
+            <w:pPr>
+              <w:spacing w:before="0" w:after="0" w:line="259" w:lineRule="auto"/>
+              <w:jc w:val="left"/>
+            </w:pPr>
+            <w:r/>
+            <w:r>
+              <w:rPr>
+                <w:rFonts w:ascii="Calibri" w:hAnsi="Calibri" w:eastAsia="Calibri"/>
+                <w:b/>
+                <w:i w:val="0"/>
+                <w:color w:val="FFFFFF"/>
+                <w:sz w:val="21"/>
+              </w:rPr>
+              <w:t>Svar</w:t>
+            </w:r>
+          </w:p>
+        </w:tc>
+      </w:tr>
+      <w:tr>
+        <w:trPr>
+          <w:cantSplit/>
+          <w:trHeight w:val="567" w:hRule="atLeast"/>
+        </w:trPr>
+        <w:tc>
+          <w:tcPr>
+            <w:tcW w:type="dxa" w:w="4535"/>
+            <w:tcBorders>
+              <w:top w:val="single" w:sz="4" w:space="0" w:color="D5DEDE"/>
+              <w:left w:val="single" w:sz="4" w:space="0" w:color="D5DEDE"/>
+              <w:bottom w:val="single" w:sz="4" w:space="0" w:color="D5DEDE"/>
+              <w:right w:val="single" w:sz="4" w:space="0" w:color="D5DEDE"/>
+            </w:tcBorders>
+            <w:tcMar>
+              <w:top w:w="80" w:type="dxa"/>
+              <w:left w:w="80" w:type="dxa"/>
+              <w:bottom w:w="80" w:type="dxa"/>
+              <w:right w:w="80" w:type="dxa"/>
+            </w:tcMar>
+            <w:shd w:fill="FFFFFF" w:val="clear"/>
+          </w:tcPr>
+          <w:p>
+            <w:pPr>
+              <w:spacing w:before="0" w:after="0" w:line="259" w:lineRule="auto"/>
+              <w:jc w:val="left"/>
+            </w:pPr>
+            <w:r/>
+            <w:r>
+              <w:rPr>
+                <w:rFonts w:ascii="Calibri" w:hAnsi="Calibri" w:eastAsia="Calibri"/>
+                <w:b w:val="0"/>
+                <w:i w:val="0"/>
+                <w:color w:val="1A1A1A"/>
+                <w:sz w:val="21"/>
+              </w:rPr>
+              <w:t>Intervall på isobarene</w:t>
+            </w:r>
+          </w:p>
+        </w:tc>
+        <w:tc>
+          <w:tcPr>
+            <w:tcW w:type="dxa" w:w="4932"/>
+            <w:tcBorders>
+              <w:top w:val="single" w:sz="4" w:space="0" w:color="D5DEDE"/>
+              <w:left w:val="single" w:sz="4" w:space="0" w:color="D5DEDE"/>
+              <w:bottom w:val="single" w:sz="4" w:space="0" w:color="D5DEDE"/>
+              <w:right w:val="single" w:sz="4" w:space="0" w:color="D5DEDE"/>
+            </w:tcBorders>
+            <w:tcMar>
+              <w:top w:w="80" w:type="dxa"/>
+              <w:left w:w="80" w:type="dxa"/>
+              <w:bottom w:w="80" w:type="dxa"/>
+              <w:right w:w="80" w:type="dxa"/>
+            </w:tcMar>
+            <w:shd w:fill="FFFFFF" w:val="clear"/>
+          </w:tcPr>
+          <w:p>
+            <w:pPr>
+              <w:spacing w:before="0" w:after="0" w:line="259" w:lineRule="auto"/>
+              <w:jc w:val="left"/>
+            </w:pPr>
+            <w:r/>
+            <w:r>
+              <w:rPr>
+                <w:rFonts w:ascii="Calibri" w:hAnsi="Calibri" w:eastAsia="Calibri"/>
+                <w:b w:val="0"/>
+                <w:i w:val="0"/>
+                <w:color w:val="1A1A1A"/>
+                <w:sz w:val="21"/>
+              </w:rPr>
+            </w:r>
+          </w:p>
+        </w:tc>
+      </w:tr>
+      <w:tr>
+        <w:trPr>
+          <w:cantSplit/>
+          <w:trHeight w:val="567" w:hRule="atLeast"/>
+        </w:trPr>
+        <w:tc>
+          <w:tcPr>
+            <w:tcW w:type="dxa" w:w="4535"/>
+            <w:tcBorders>
+              <w:top w:val="single" w:sz="4" w:space="0" w:color="D5DEDE"/>
+              <w:left w:val="single" w:sz="4" w:space="0" w:color="D5DEDE"/>
+              <w:bottom w:val="single" w:sz="4" w:space="0" w:color="D5DEDE"/>
+              <w:right w:val="single" w:sz="4" w:space="0" w:color="D5DEDE"/>
+            </w:tcBorders>
+            <w:tcMar>
+              <w:top w:w="80" w:type="dxa"/>
+              <w:left w:w="80" w:type="dxa"/>
+              <w:bottom w:w="80" w:type="dxa"/>
+              <w:right w:w="80" w:type="dxa"/>
+            </w:tcMar>
+            <w:shd w:fill="F4F7F7" w:val="clear"/>
+          </w:tcPr>
+          <w:p>
+            <w:pPr>
+              <w:spacing w:before="0" w:after="0" w:line="259" w:lineRule="auto"/>
+              <w:jc w:val="left"/>
+            </w:pPr>
+            <w:r/>
+            <w:r>
+              <w:rPr>
+                <w:rFonts w:ascii="Calibri" w:hAnsi="Calibri" w:eastAsia="Calibri"/>
+                <w:b w:val="0"/>
+                <w:i w:val="0"/>
+                <w:color w:val="1A1A1A"/>
+                <w:sz w:val="21"/>
+              </w:rPr>
+              <w:t>Laveste havnivåtrykk</w:t>
+            </w:r>
+          </w:p>
+        </w:tc>
+        <w:tc>
+          <w:tcPr>
+            <w:tcW w:type="dxa" w:w="4932"/>
+            <w:tcBorders>
+              <w:top w:val="single" w:sz="4" w:space="0" w:color="D5DEDE"/>
+              <w:left w:val="single" w:sz="4" w:space="0" w:color="D5DEDE"/>
+              <w:bottom w:val="single" w:sz="4" w:space="0" w:color="D5DEDE"/>
+              <w:right w:val="single" w:sz="4" w:space="0" w:color="D5DEDE"/>
+            </w:tcBorders>
+            <w:tcMar>
+              <w:top w:w="80" w:type="dxa"/>
+              <w:left w:w="80" w:type="dxa"/>
+              <w:bottom w:w="80" w:type="dxa"/>
+              <w:right w:w="80" w:type="dxa"/>
+            </w:tcMar>
+            <w:shd w:fill="F4F7F7" w:val="clear"/>
+          </w:tcPr>
+          <w:p>
+            <w:pPr>
+              <w:spacing w:before="0" w:after="0" w:line="259" w:lineRule="auto"/>
+              <w:jc w:val="left"/>
+            </w:pPr>
+            <w:r/>
+            <w:r>
+              <w:rPr>
+                <w:rFonts w:ascii="Calibri" w:hAnsi="Calibri" w:eastAsia="Calibri"/>
+                <w:b w:val="0"/>
+                <w:i w:val="0"/>
+                <w:color w:val="1A1A1A"/>
+                <w:sz w:val="21"/>
+              </w:rPr>
+            </w:r>
+          </w:p>
+        </w:tc>
+      </w:tr>
+      <w:tr>
+        <w:trPr>
+          <w:cantSplit/>
+          <w:trHeight w:val="567" w:hRule="atLeast"/>
+        </w:trPr>
+        <w:tc>
+          <w:tcPr>
+            <w:tcW w:type="dxa" w:w="4535"/>
+            <w:tcBorders>
+              <w:top w:val="single" w:sz="4" w:space="0" w:color="D5DEDE"/>
+              <w:left w:val="single" w:sz="4" w:space="0" w:color="D5DEDE"/>
+              <w:bottom w:val="single" w:sz="4" w:space="0" w:color="D5DEDE"/>
+              <w:right w:val="single" w:sz="4" w:space="0" w:color="D5DEDE"/>
+            </w:tcBorders>
+            <w:tcMar>
+              <w:top w:w="80" w:type="dxa"/>
+              <w:left w:w="80" w:type="dxa"/>
+              <w:bottom w:w="80" w:type="dxa"/>
+              <w:right w:w="80" w:type="dxa"/>
+            </w:tcMar>
+            <w:shd w:fill="FFFFFF" w:val="clear"/>
+          </w:tcPr>
+          <w:p>
+            <w:pPr>
+              <w:spacing w:before="0" w:after="0" w:line="259" w:lineRule="auto"/>
+              <w:jc w:val="left"/>
+            </w:pPr>
+            <w:r/>
+            <w:r>
+              <w:rPr>
+                <w:rFonts w:ascii="Calibri" w:hAnsi="Calibri" w:eastAsia="Calibri"/>
+                <w:b w:val="0"/>
+                <w:i w:val="0"/>
+                <w:color w:val="1A1A1A"/>
+                <w:sz w:val="21"/>
+              </w:rPr>
+              <w:t>Høyeste havnivåtrykk</w:t>
+            </w:r>
+          </w:p>
+        </w:tc>
+        <w:tc>
+          <w:tcPr>
+            <w:tcW w:type="dxa" w:w="4932"/>
+            <w:tcBorders>
+              <w:top w:val="single" w:sz="4" w:space="0" w:color="D5DEDE"/>
+              <w:left w:val="single" w:sz="4" w:space="0" w:color="D5DEDE"/>
+              <w:bottom w:val="single" w:sz="4" w:space="0" w:color="D5DEDE"/>
+              <w:right w:val="single" w:sz="4" w:space="0" w:color="D5DEDE"/>
+            </w:tcBorders>
+            <w:tcMar>
+              <w:top w:w="80" w:type="dxa"/>
+              <w:left w:w="80" w:type="dxa"/>
+              <w:bottom w:w="80" w:type="dxa"/>
+              <w:right w:w="80" w:type="dxa"/>
+            </w:tcMar>
+            <w:shd w:fill="FFFFFF" w:val="clear"/>
+          </w:tcPr>
+          <w:p>
+            <w:pPr>
+              <w:spacing w:before="0" w:after="0" w:line="259" w:lineRule="auto"/>
+              <w:jc w:val="left"/>
+            </w:pPr>
+            <w:r/>
+            <w:r>
+              <w:rPr>
+                <w:rFonts w:ascii="Calibri" w:hAnsi="Calibri" w:eastAsia="Calibri"/>
+                <w:b w:val="0"/>
+                <w:i w:val="0"/>
+                <w:color w:val="1A1A1A"/>
+                <w:sz w:val="21"/>
+              </w:rPr>
+            </w:r>
+          </w:p>
+        </w:tc>
+      </w:tr>
+      <w:tr>
+        <w:trPr>
+          <w:cantSplit/>
+          <w:trHeight w:val="567" w:hRule="atLeast"/>
+        </w:trPr>
+        <w:tc>
+          <w:tcPr>
+            <w:tcW w:type="dxa" w:w="4535"/>
+            <w:tcBorders>
+              <w:top w:val="single" w:sz="4" w:space="0" w:color="D5DEDE"/>
+              <w:left w:val="single" w:sz="4" w:space="0" w:color="D5DEDE"/>
+              <w:bottom w:val="single" w:sz="4" w:space="0" w:color="D5DEDE"/>
+              <w:right w:val="single" w:sz="4" w:space="0" w:color="D5DEDE"/>
+            </w:tcBorders>
+            <w:tcMar>
+              <w:top w:w="80" w:type="dxa"/>
+              <w:left w:w="80" w:type="dxa"/>
+              <w:bottom w:w="80" w:type="dxa"/>
+              <w:right w:w="80" w:type="dxa"/>
+            </w:tcMar>
+            <w:shd w:fill="F4F7F7" w:val="clear"/>
+          </w:tcPr>
+          <w:p>
+            <w:pPr>
+              <w:spacing w:before="0" w:after="0" w:line="259" w:lineRule="auto"/>
+              <w:jc w:val="left"/>
+            </w:pPr>
+            <w:r/>
+            <w:r>
+              <w:rPr>
+                <w:rFonts w:ascii="Calibri" w:hAnsi="Calibri" w:eastAsia="Calibri"/>
+                <w:b w:val="0"/>
+                <w:i w:val="0"/>
+                <w:color w:val="1A1A1A"/>
+                <w:sz w:val="21"/>
+              </w:rPr>
+              <w:t>Trykket faller mot</w:t>
+            </w:r>
+          </w:p>
+        </w:tc>
+        <w:tc>
+          <w:tcPr>
+            <w:tcW w:type="dxa" w:w="4932"/>
+            <w:tcBorders>
+              <w:top w:val="single" w:sz="4" w:space="0" w:color="D5DEDE"/>
+              <w:left w:val="single" w:sz="4" w:space="0" w:color="D5DEDE"/>
+              <w:bottom w:val="single" w:sz="4" w:space="0" w:color="D5DEDE"/>
+              <w:right w:val="single" w:sz="4" w:space="0" w:color="D5DEDE"/>
+            </w:tcBorders>
+            <w:tcMar>
+              <w:top w:w="80" w:type="dxa"/>
+              <w:left w:w="80" w:type="dxa"/>
+              <w:bottom w:w="80" w:type="dxa"/>
+              <w:right w:w="80" w:type="dxa"/>
+            </w:tcMar>
+            <w:shd w:fill="F4F7F7" w:val="clear"/>
+          </w:tcPr>
+          <w:p>
+            <w:pPr>
+              <w:spacing w:before="0" w:after="0" w:line="259" w:lineRule="auto"/>
+              <w:jc w:val="left"/>
+            </w:pPr>
+            <w:r/>
+            <w:r>
+              <w:rPr>
+                <w:rFonts w:ascii="Calibri" w:hAnsi="Calibri" w:eastAsia="Calibri"/>
+                <w:b w:val="0"/>
+                <w:i w:val="0"/>
+                <w:color w:val="1A1A1A"/>
+                <w:sz w:val="21"/>
+              </w:rPr>
+            </w:r>
+          </w:p>
+        </w:tc>
+      </w:tr>
+      <w:tr>
+        <w:trPr>
+          <w:cantSplit/>
+          <w:trHeight w:val="567" w:hRule="atLeast"/>
+        </w:trPr>
+        <w:tc>
+          <w:tcPr>
+            <w:tcW w:type="dxa" w:w="4535"/>
+            <w:tcBorders>
+              <w:top w:val="single" w:sz="4" w:space="0" w:color="D5DEDE"/>
+              <w:left w:val="single" w:sz="4" w:space="0" w:color="D5DEDE"/>
+              <w:bottom w:val="single" w:sz="4" w:space="0" w:color="D5DEDE"/>
+              <w:right w:val="single" w:sz="4" w:space="0" w:color="D5DEDE"/>
+            </w:tcBorders>
+            <w:tcMar>
+              <w:top w:w="80" w:type="dxa"/>
+              <w:left w:w="80" w:type="dxa"/>
+              <w:bottom w:w="80" w:type="dxa"/>
+              <w:right w:w="80" w:type="dxa"/>
+            </w:tcMar>
+            <w:shd w:fill="FFFFFF" w:val="clear"/>
+          </w:tcPr>
+          <w:p>
+            <w:pPr>
+              <w:spacing w:before="0" w:after="0" w:line="259" w:lineRule="auto"/>
+              <w:jc w:val="left"/>
+            </w:pPr>
+            <w:r/>
+            <w:r>
+              <w:rPr>
+                <w:rFonts w:ascii="Calibri" w:hAnsi="Calibri" w:eastAsia="Calibri"/>
+                <w:b w:val="0"/>
+                <w:i w:val="0"/>
+                <w:color w:val="1A1A1A"/>
+                <w:sz w:val="21"/>
+              </w:rPr>
+              <w:t>Stemmer retningen med værkartet?</w:t>
+            </w:r>
+          </w:p>
+        </w:tc>
+        <w:tc>
+          <w:tcPr>
+            <w:tcW w:type="dxa" w:w="4932"/>
+            <w:tcBorders>
+              <w:top w:val="single" w:sz="4" w:space="0" w:color="D5DEDE"/>
+              <w:left w:val="single" w:sz="4" w:space="0" w:color="D5DEDE"/>
+              <w:bottom w:val="single" w:sz="4" w:space="0" w:color="D5DEDE"/>
+              <w:right w:val="single" w:sz="4" w:space="0" w:color="D5DEDE"/>
+            </w:tcBorders>
+            <w:tcMar>
+              <w:top w:w="80" w:type="dxa"/>
+              <w:left w:w="80" w:type="dxa"/>
+              <w:bottom w:w="80" w:type="dxa"/>
+              <w:right w:w="80" w:type="dxa"/>
+            </w:tcMar>
+            <w:shd w:fill="FFFFFF" w:val="clear"/>
+          </w:tcPr>
+          <w:p>
+            <w:pPr>
+              <w:spacing w:before="0" w:after="0" w:line="259" w:lineRule="auto"/>
+              <w:jc w:val="left"/>
+            </w:pPr>
+            <w:r/>
+            <w:r>
+              <w:rPr>
+                <w:rFonts w:ascii="Calibri" w:hAnsi="Calibri" w:eastAsia="Calibri"/>
+                <w:b w:val="0"/>
+                <w:i w:val="0"/>
+                <w:color w:val="1A1A1A"/>
+                <w:sz w:val="21"/>
+              </w:rPr>
+            </w:r>
+          </w:p>
+        </w:tc>
+      </w:tr>
+      <w:tr>
+        <w:trPr>
+          <w:cantSplit/>
+          <w:trHeight w:val="567" w:hRule="atLeast"/>
+        </w:trPr>
+        <w:tc>
+          <w:tcPr>
+            <w:tcW w:type="dxa" w:w="4535"/>
+            <w:tcBorders>
+              <w:top w:val="single" w:sz="4" w:space="0" w:color="D5DEDE"/>
+              <w:left w:val="single" w:sz="4" w:space="0" w:color="D5DEDE"/>
+              <w:bottom w:val="single" w:sz="4" w:space="0" w:color="D5DEDE"/>
+              <w:right w:val="single" w:sz="4" w:space="0" w:color="D5DEDE"/>
+            </w:tcBorders>
+            <w:tcMar>
+              <w:top w:w="80" w:type="dxa"/>
+              <w:left w:w="80" w:type="dxa"/>
+              <w:bottom w:w="80" w:type="dxa"/>
+              <w:right w:w="80" w:type="dxa"/>
+            </w:tcMar>
+            <w:shd w:fill="F4F7F7" w:val="clear"/>
+          </w:tcPr>
+          <w:p>
+            <w:pPr>
+              <w:spacing w:before="0" w:after="0" w:line="259" w:lineRule="auto"/>
+              <w:jc w:val="left"/>
+            </w:pPr>
+            <w:r/>
+            <w:r>
+              <w:rPr>
+                <w:rFonts w:ascii="Calibri" w:hAnsi="Calibri" w:eastAsia="Calibri"/>
+                <w:b w:val="0"/>
+                <w:i w:val="0"/>
+                <w:color w:val="1A1A1A"/>
+                <w:sz w:val="21"/>
+              </w:rPr>
+              <w:t>Er linjene like tette som på kartet?</w:t>
+            </w:r>
+          </w:p>
+        </w:tc>
+        <w:tc>
+          <w:tcPr>
+            <w:tcW w:type="dxa" w:w="4932"/>
+            <w:tcBorders>
+              <w:top w:val="single" w:sz="4" w:space="0" w:color="D5DEDE"/>
+              <w:left w:val="single" w:sz="4" w:space="0" w:color="D5DEDE"/>
+              <w:bottom w:val="single" w:sz="4" w:space="0" w:color="D5DEDE"/>
+              <w:right w:val="single" w:sz="4" w:space="0" w:color="D5DEDE"/>
+            </w:tcBorders>
+            <w:tcMar>
+              <w:top w:w="80" w:type="dxa"/>
+              <w:left w:w="80" w:type="dxa"/>
+              <w:bottom w:w="80" w:type="dxa"/>
+              <w:right w:w="80" w:type="dxa"/>
+            </w:tcMar>
+            <w:shd w:fill="F4F7F7" w:val="clear"/>
+          </w:tcPr>
+          <w:p>
+            <w:pPr>
+              <w:spacing w:before="0" w:after="0" w:line="259" w:lineRule="auto"/>
+              <w:jc w:val="left"/>
+            </w:pPr>
+            <w:r/>
+            <w:r>
+              <w:rPr>
+                <w:rFonts w:ascii="Calibri" w:hAnsi="Calibri" w:eastAsia="Calibri"/>
+                <w:b w:val="0"/>
+                <w:i w:val="0"/>
+                <w:color w:val="1A1A1A"/>
+                <w:sz w:val="21"/>
+              </w:rPr>
+            </w:r>
+          </w:p>
+        </w:tc>
+      </w:tr>
+    </w:tbl>
+    <w:p/>
+    <w:p>
+      <w:pPr>
+        <w:spacing w:before="0" w:after="80" w:line="276" w:lineRule="auto"/>
+      </w:pPr>
+      <w:r>
+        <w:rPr>
+          <w:rFonts w:ascii="Calibri" w:hAnsi="Calibri" w:eastAsia="Calibri"/>
+          <w:b w:val="0"/>
+          <w:i w:val="0"/>
+          <w:color w:val="1A1A1A"/>
+          <w:sz w:val="22"/>
+        </w:rPr>
         <w:t>Kort konklusjon om denne timen:</w:t>
       </w:r>
     </w:p>

</xml_diff>

<commit_message>
docs: legg inn løypekart og isobarkart i feltopplegget
Kart 1 følger grusstien rundt Sognsvann med post A–D. Kart 2 viser trykkpunktene fra Vetakolltoppen til Blindern.

Co-authored-by: MatsAmundsen <MatsAmundsen@users.noreply.github.com>
</commit_message>
<xml_diff>
--- a/opplegg/vaerkart-sognsvann.docx
+++ b/opplegg/vaerkart-sognsvann.docx
@@ -978,6 +978,62 @@
       </w:tr>
     </w:tbl>
     <w:p/>
+    <w:p>
+      <w:pPr>
+        <w:spacing w:before="160" w:after="40"/>
+        <w:jc w:val="center"/>
+      </w:pPr>
+      <w:r>
+        <w:drawing>
+          <wp:inline xmlns:a="http://schemas.openxmlformats.org/drawingml/2006/main" xmlns:pic="http://schemas.openxmlformats.org/drawingml/2006/picture">
+            <wp:extent cx="6048000" cy="9385668"/>
+            <wp:docPr id="1" name="Picture 1"/>
+            <wp:cNvGraphicFramePr>
+              <a:graphicFrameLocks noChangeAspect="1"/>
+            </wp:cNvGraphicFramePr>
+            <a:graphic>
+              <a:graphicData uri="http://schemas.openxmlformats.org/drawingml/2006/picture">
+                <pic:pic>
+                  <pic:nvPicPr>
+                    <pic:cNvPr id="0" name="kart-loype.png"/>
+                    <pic:cNvPicPr/>
+                  </pic:nvPicPr>
+                  <pic:blipFill>
+                    <a:blip r:embed="rId11"/>
+                    <a:stretch>
+                      <a:fillRect/>
+                    </a:stretch>
+                  </pic:blipFill>
+                  <pic:spPr>
+                    <a:xfrm>
+                      <a:off x="0" y="0"/>
+                      <a:ext cx="6048000" cy="9385668"/>
+                    </a:xfrm>
+                    <a:prstGeom prst="rect"/>
+                  </pic:spPr>
+                </pic:pic>
+              </a:graphicData>
+            </a:graphic>
+          </wp:inline>
+        </w:drawing>
+      </w:r>
+    </w:p>
+    <w:p>
+      <w:pPr>
+        <w:spacing w:before="0" w:after="200"/>
+        <w:jc w:val="center"/>
+      </w:pPr>
+      <w:r>
+        <w:rPr>
+          <w:rFonts w:ascii="Calibri" w:hAnsi="Calibri" w:eastAsia="Calibri"/>
+          <w:b w:val="0"/>
+          <w:i/>
+          <w:color w:val="4A555A"/>
+          <w:sz w:val="19"/>
+        </w:rPr>
+        <w:t>Kart 1. Grusstien rundt Sognsvann. Alle går med klokka, med vannet på høyre hånd. Rød strek er løypa. A–D er målepostene.</w:t>
+      </w:r>
+    </w:p>
     <w:p>
       <w:pPr>
         <w:pStyle w:val="Heading1"/>
@@ -4558,6 +4614,62 @@
       </w:tr>
     </w:tbl>
     <w:p/>
+    <w:p>
+      <w:pPr>
+        <w:spacing w:before="160" w:after="40"/>
+        <w:jc w:val="center"/>
+      </w:pPr>
+      <w:r>
+        <w:drawing>
+          <wp:inline xmlns:a="http://schemas.openxmlformats.org/drawingml/2006/main" xmlns:pic="http://schemas.openxmlformats.org/drawingml/2006/picture">
+            <wp:extent cx="6048000" cy="7523285"/>
+            <wp:docPr id="2" name="Picture 2"/>
+            <wp:cNvGraphicFramePr>
+              <a:graphicFrameLocks noChangeAspect="1"/>
+            </wp:cNvGraphicFramePr>
+            <a:graphic>
+              <a:graphicData uri="http://schemas.openxmlformats.org/drawingml/2006/picture">
+                <pic:pic>
+                  <pic:nvPicPr>
+                    <pic:cNvPr id="0" name="kart-isobarer.png"/>
+                    <pic:cNvPicPr/>
+                  </pic:nvPicPr>
+                  <pic:blipFill>
+                    <a:blip r:embed="rId12"/>
+                    <a:stretch>
+                      <a:fillRect/>
+                    </a:stretch>
+                  </pic:blipFill>
+                  <pic:spPr>
+                    <a:xfrm>
+                      <a:off x="0" y="0"/>
+                      <a:ext cx="6048000" cy="7523285"/>
+                    </a:xfrm>
+                    <a:prstGeom prst="rect"/>
+                  </pic:spPr>
+                </pic:pic>
+              </a:graphicData>
+            </a:graphic>
+          </wp:inline>
+        </w:drawing>
+      </w:r>
+    </w:p>
+    <w:p>
+      <w:pPr>
+        <w:spacing w:before="0" w:after="200"/>
+        <w:jc w:val="center"/>
+      </w:pPr>
+      <w:r>
+        <w:rPr>
+          <w:rFonts w:ascii="Calibri" w:hAnsi="Calibri" w:eastAsia="Calibri"/>
+          <w:b w:val="0"/>
+          <w:i/>
+          <w:color w:val="4A555A"/>
+          <w:sz w:val="19"/>
+        </w:rPr>
+        <w:t>Kart 2. Trykkpunktene for isobarene. Rød strek er til fots. Blå strek er T-bane linje 5 sørover til Blindern.</w:t>
+      </w:r>
+    </w:p>
     <w:p>
       <w:pPr>
         <w:spacing w:before="0" w:after="160" w:line="276" w:lineRule="auto"/>

</xml_diff>